<commit_message>
Final README update with Kafka Databricks and CI/CD
</commit_message>
<xml_diff>
--- a/PGDDE_Capstone_Project_Report_Healthcare_Analytics_Pipeline.docx
+++ b/PGDDE_Capstone_Project_Report_Healthcare_Analytics_Pipeline.docx
@@ -482,11 +482,10 @@
       </w:tblPr>
       <w:tblGrid>
         <w:gridCol w:w="2605"/>
-        <w:gridCol w:w="2430"/>
+        <w:gridCol w:w="3420"/>
       </w:tblGrid>
       <w:tr>
         <w:trPr>
-          <w:trHeight w:val="457"/>
           <w:tblHeader/>
           <w:tblCellSpacing w:w="15" w:type="dxa"/>
         </w:trPr>
@@ -514,7 +513,7 @@
         </w:tc>
         <w:tc>
           <w:tcPr>
-            <w:tcW w:w="2385" w:type="dxa"/>
+            <w:tcW w:w="3375" w:type="dxa"/>
             <w:vAlign w:val="center"/>
             <w:hideMark/>
           </w:tcPr>
@@ -553,7 +552,7 @@
         </w:tc>
         <w:tc>
           <w:tcPr>
-            <w:tcW w:w="2385" w:type="dxa"/>
+            <w:tcW w:w="3375" w:type="dxa"/>
             <w:vAlign w:val="center"/>
             <w:hideMark/>
           </w:tcPr>
@@ -582,7 +581,7 @@
         </w:tc>
         <w:tc>
           <w:tcPr>
-            <w:tcW w:w="2385" w:type="dxa"/>
+            <w:tcW w:w="3375" w:type="dxa"/>
             <w:vAlign w:val="center"/>
             <w:hideMark/>
           </w:tcPr>
@@ -611,7 +610,7 @@
         </w:tc>
         <w:tc>
           <w:tcPr>
-            <w:tcW w:w="2385" w:type="dxa"/>
+            <w:tcW w:w="3375" w:type="dxa"/>
             <w:vAlign w:val="center"/>
             <w:hideMark/>
           </w:tcPr>
@@ -640,13 +639,13 @@
         </w:tc>
         <w:tc>
           <w:tcPr>
-            <w:tcW w:w="2385" w:type="dxa"/>
-            <w:vAlign w:val="center"/>
-            <w:hideMark/>
-          </w:tcPr>
-          <w:p>
-            <w:r>
-              <w:t>PySpark</w:t>
+            <w:tcW w:w="3375" w:type="dxa"/>
+            <w:vAlign w:val="center"/>
+            <w:hideMark/>
+          </w:tcPr>
+          <w:p>
+            <w:r>
+              <w:t>PySpark, Databricks</w:t>
             </w:r>
           </w:p>
         </w:tc>
@@ -663,19 +662,19 @@
           </w:tcPr>
           <w:p>
             <w:r>
-              <w:t>Cloud Storage</w:t>
-            </w:r>
-          </w:p>
-        </w:tc>
-        <w:tc>
-          <w:tcPr>
-            <w:tcW w:w="2385" w:type="dxa"/>
-            <w:vAlign w:val="center"/>
-            <w:hideMark/>
-          </w:tcPr>
-          <w:p>
-            <w:r>
-              <w:t>AWS S3</w:t>
+              <w:t>Data Streaming</w:t>
+            </w:r>
+          </w:p>
+        </w:tc>
+        <w:tc>
+          <w:tcPr>
+            <w:tcW w:w="3375" w:type="dxa"/>
+            <w:vAlign w:val="center"/>
+            <w:hideMark/>
+          </w:tcPr>
+          <w:p>
+            <w:r>
+              <w:t>Apache Kafka</w:t>
             </w:r>
           </w:p>
         </w:tc>
@@ -692,19 +691,19 @@
           </w:tcPr>
           <w:p>
             <w:r>
-              <w:t>Database</w:t>
-            </w:r>
-          </w:p>
-        </w:tc>
-        <w:tc>
-          <w:tcPr>
-            <w:tcW w:w="2385" w:type="dxa"/>
-            <w:vAlign w:val="center"/>
-            <w:hideMark/>
-          </w:tcPr>
-          <w:p>
-            <w:r>
-              <w:t>PostgreSQL</w:t>
+              <w:t>Cloud Storage</w:t>
+            </w:r>
+          </w:p>
+        </w:tc>
+        <w:tc>
+          <w:tcPr>
+            <w:tcW w:w="3375" w:type="dxa"/>
+            <w:vAlign w:val="center"/>
+            <w:hideMark/>
+          </w:tcPr>
+          <w:p>
+            <w:r>
+              <w:t>AWS S3</w:t>
             </w:r>
           </w:p>
         </w:tc>
@@ -721,19 +720,19 @@
           </w:tcPr>
           <w:p>
             <w:r>
-              <w:t>Cloud Database</w:t>
-            </w:r>
-          </w:p>
-        </w:tc>
-        <w:tc>
-          <w:tcPr>
-            <w:tcW w:w="2385" w:type="dxa"/>
-            <w:vAlign w:val="center"/>
-            <w:hideMark/>
-          </w:tcPr>
-          <w:p>
-            <w:r>
-              <w:t>AWS RDS PostgreSQL</w:t>
+              <w:t>Database</w:t>
+            </w:r>
+          </w:p>
+        </w:tc>
+        <w:tc>
+          <w:tcPr>
+            <w:tcW w:w="3375" w:type="dxa"/>
+            <w:vAlign w:val="center"/>
+            <w:hideMark/>
+          </w:tcPr>
+          <w:p>
+            <w:r>
+              <w:t>PostgreSQL</w:t>
             </w:r>
           </w:p>
         </w:tc>
@@ -750,19 +749,19 @@
           </w:tcPr>
           <w:p>
             <w:r>
-              <w:t>Data Warehouse</w:t>
-            </w:r>
-          </w:p>
-        </w:tc>
-        <w:tc>
-          <w:tcPr>
-            <w:tcW w:w="2385" w:type="dxa"/>
-            <w:vAlign w:val="center"/>
-            <w:hideMark/>
-          </w:tcPr>
-          <w:p>
-            <w:r>
-              <w:t>Star Schema</w:t>
+              <w:t>Cloud Database</w:t>
+            </w:r>
+          </w:p>
+        </w:tc>
+        <w:tc>
+          <w:tcPr>
+            <w:tcW w:w="3375" w:type="dxa"/>
+            <w:vAlign w:val="center"/>
+            <w:hideMark/>
+          </w:tcPr>
+          <w:p>
+            <w:r>
+              <w:t>AWS RDS PostgreSQL</w:t>
             </w:r>
           </w:p>
         </w:tc>
@@ -779,19 +778,19 @@
           </w:tcPr>
           <w:p>
             <w:r>
-              <w:t>Dashboard</w:t>
-            </w:r>
-          </w:p>
-        </w:tc>
-        <w:tc>
-          <w:tcPr>
-            <w:tcW w:w="2385" w:type="dxa"/>
-            <w:vAlign w:val="center"/>
-            <w:hideMark/>
-          </w:tcPr>
-          <w:p>
-            <w:r>
-              <w:t>Streamlit</w:t>
+              <w:t>Data Warehouse</w:t>
+            </w:r>
+          </w:p>
+        </w:tc>
+        <w:tc>
+          <w:tcPr>
+            <w:tcW w:w="3375" w:type="dxa"/>
+            <w:vAlign w:val="center"/>
+            <w:hideMark/>
+          </w:tcPr>
+          <w:p>
+            <w:r>
+              <w:t>Star Schema</w:t>
             </w:r>
           </w:p>
         </w:tc>
@@ -808,19 +807,19 @@
           </w:tcPr>
           <w:p>
             <w:r>
-              <w:t>Machine Learning</w:t>
-            </w:r>
-          </w:p>
-        </w:tc>
-        <w:tc>
-          <w:tcPr>
-            <w:tcW w:w="2385" w:type="dxa"/>
-            <w:vAlign w:val="center"/>
-            <w:hideMark/>
-          </w:tcPr>
-          <w:p>
-            <w:r>
-              <w:t>Scikit-Learn</w:t>
+              <w:t>Dashboard</w:t>
+            </w:r>
+          </w:p>
+        </w:tc>
+        <w:tc>
+          <w:tcPr>
+            <w:tcW w:w="3375" w:type="dxa"/>
+            <w:vAlign w:val="center"/>
+            <w:hideMark/>
+          </w:tcPr>
+          <w:p>
+            <w:r>
+              <w:t>Streamlit</w:t>
             </w:r>
           </w:p>
         </w:tc>
@@ -837,19 +836,19 @@
           </w:tcPr>
           <w:p>
             <w:r>
-              <w:t>Version Control</w:t>
-            </w:r>
-          </w:p>
-        </w:tc>
-        <w:tc>
-          <w:tcPr>
-            <w:tcW w:w="2385" w:type="dxa"/>
-            <w:vAlign w:val="center"/>
-            <w:hideMark/>
-          </w:tcPr>
-          <w:p>
-            <w:r>
-              <w:t>Git &amp; GitHub</w:t>
+              <w:t>Machine Learning</w:t>
+            </w:r>
+          </w:p>
+        </w:tc>
+        <w:tc>
+          <w:tcPr>
+            <w:tcW w:w="3375" w:type="dxa"/>
+            <w:vAlign w:val="center"/>
+            <w:hideMark/>
+          </w:tcPr>
+          <w:p>
+            <w:r>
+              <w:t>Scikit-Learn, Random Forest</w:t>
             </w:r>
           </w:p>
         </w:tc>
@@ -866,13 +865,71 @@
           </w:tcPr>
           <w:p>
             <w:r>
+              <w:t>Version Control</w:t>
+            </w:r>
+          </w:p>
+        </w:tc>
+        <w:tc>
+          <w:tcPr>
+            <w:tcW w:w="3375" w:type="dxa"/>
+            <w:vAlign w:val="center"/>
+            <w:hideMark/>
+          </w:tcPr>
+          <w:p>
+            <w:r>
+              <w:t>Git &amp; GitHub</w:t>
+            </w:r>
+          </w:p>
+        </w:tc>
+      </w:tr>
+      <w:tr>
+        <w:trPr>
+          <w:tblCellSpacing w:w="15" w:type="dxa"/>
+        </w:trPr>
+        <w:tc>
+          <w:tcPr>
+            <w:tcW w:w="2560" w:type="dxa"/>
+            <w:vAlign w:val="center"/>
+            <w:hideMark/>
+          </w:tcPr>
+          <w:p>
+            <w:r>
+              <w:t>CI/CD</w:t>
+            </w:r>
+          </w:p>
+        </w:tc>
+        <w:tc>
+          <w:tcPr>
+            <w:tcW w:w="3375" w:type="dxa"/>
+            <w:vAlign w:val="center"/>
+            <w:hideMark/>
+          </w:tcPr>
+          <w:p>
+            <w:r>
+              <w:t>GitHub Actions</w:t>
+            </w:r>
+          </w:p>
+        </w:tc>
+      </w:tr>
+      <w:tr>
+        <w:trPr>
+          <w:tblCellSpacing w:w="15" w:type="dxa"/>
+        </w:trPr>
+        <w:tc>
+          <w:tcPr>
+            <w:tcW w:w="2560" w:type="dxa"/>
+            <w:vAlign w:val="center"/>
+            <w:hideMark/>
+          </w:tcPr>
+          <w:p>
+            <w:r>
               <w:t>Containerization</w:t>
             </w:r>
           </w:p>
         </w:tc>
         <w:tc>
           <w:tcPr>
-            <w:tcW w:w="2385" w:type="dxa"/>
+            <w:tcW w:w="3375" w:type="dxa"/>
             <w:vAlign w:val="center"/>
             <w:hideMark/>
           </w:tcPr>
@@ -936,6 +993,7 @@
           <w:b/>
           <w:bCs/>
         </w:rPr>
+        <w:lastRenderedPageBreak/>
         <w:t>Benefits:</w:t>
       </w:r>
     </w:p>
@@ -946,7 +1004,6 @@
     </w:p>
     <w:p>
       <w:r>
-        <w:lastRenderedPageBreak/>
         <w:t>• Cloud-based accessibility</w:t>
       </w:r>
     </w:p>
@@ -1104,8 +1161,9 @@
         <w:rPr>
           <w:noProof/>
         </w:rPr>
+        <w:lastRenderedPageBreak/>
         <w:drawing>
-          <wp:inline distT="0" distB="0" distL="0" distR="0" wp14:anchorId="64F555DE" wp14:editId="1DAF3BBD">
+          <wp:inline distT="0" distB="0" distL="0" distR="0" wp14:anchorId="64F555DE" wp14:editId="35C2E8B1">
             <wp:extent cx="5731510" cy="1480820"/>
             <wp:effectExtent l="0" t="0" r="2540" b="5080"/>
             <wp:docPr id="1158384236" name="Picture 3"/>
@@ -1150,37 +1208,252 @@
     <w:p>
       <w:r>
         <w:pict w14:anchorId="1FF4F928">
-          <v:rect id="_x0000_i1032" style="width:0;height:1.5pt" o:hralign="center" o:hrstd="t" o:hr="t" fillcolor="#a0a0a0" stroked="f"/>
+          <v:rect id="_x0000_i1032" style="width:0;height:1.5pt" o:hralign="center" o:bullet="t" o:hrstd="t" o:hr="t" fillcolor="#a0a0a0" stroked="f"/>
         </w:pict>
       </w:r>
     </w:p>
     <w:p>
+      <w:pPr>
+        <w:rPr>
+          <w:b/>
+          <w:bCs/>
+        </w:rPr>
+      </w:pPr>
+      <w:r>
+        <w:rPr>
+          <w:b/>
+          <w:bCs/>
+        </w:rPr>
+        <w:t>Step 3 — Apache Kafka Streaming Integration</w:t>
+      </w:r>
+    </w:p>
+    <w:p>
+      <w:r>
+        <w:t>Apache Kafka was implemented to demonstrate real-time healthcare data streaming concepts.</w:t>
+      </w:r>
+    </w:p>
+    <w:p>
+      <w:r>
+        <w:t>Activities Performed:</w:t>
+      </w:r>
+    </w:p>
+    <w:p>
+      <w:r>
+        <w:t>• Kafka Producer implementation</w:t>
+      </w:r>
+    </w:p>
+    <w:p>
+      <w:r>
+        <w:t>• Kafka Consumer implementation</w:t>
+      </w:r>
+    </w:p>
+    <w:p>
+      <w:r>
+        <w:t>• Healthcare message streaming</w:t>
+      </w:r>
+    </w:p>
+    <w:p>
+      <w:r>
+        <w:t>• Real-time ingestion validation</w:t>
+      </w:r>
+    </w:p>
+    <w:p>
+      <w:r>
+        <w:t>Benefits:</w:t>
+      </w:r>
+    </w:p>
+    <w:p>
+      <w:r>
+        <w:t>• Event-driven architecture</w:t>
+      </w:r>
+    </w:p>
+    <w:p>
+      <w:r>
+        <w:t>• Real-time data ingestion</w:t>
+      </w:r>
+    </w:p>
+    <w:p>
+      <w:r>
+        <w:t>• Scalable streaming platform</w:t>
+      </w:r>
+    </w:p>
+    <w:p>
+      <w:r>
+        <w:t>• Future-ready healthcare pipeline</w:t>
+      </w:r>
+    </w:p>
+    <w:p>
+      <w:r>
+        <w:t>The Kafka Producer and Consumer successfully exchanged healthcare records, demonstrating streaming capabilities.</w:t>
+      </w:r>
+    </w:p>
+    <w:p>
+      <w:r>
+        <w:rPr>
+          <w:noProof/>
+        </w:rPr>
+        <w:drawing>
+          <wp:inline distT="0" distB="0" distL="0" distR="0" wp14:anchorId="73167C00" wp14:editId="3E7B56AC">
+            <wp:extent cx="5731510" cy="707390"/>
+            <wp:effectExtent l="0" t="0" r="2540" b="0"/>
+            <wp:docPr id="1057408434" name="Picture 1"/>
+            <wp:cNvGraphicFramePr>
+              <a:graphicFrameLocks xmlns:a="http://schemas.openxmlformats.org/drawingml/2006/main" noChangeAspect="1"/>
+            </wp:cNvGraphicFramePr>
+            <a:graphic xmlns:a="http://schemas.openxmlformats.org/drawingml/2006/main">
+              <a:graphicData uri="http://schemas.openxmlformats.org/drawingml/2006/picture">
+                <pic:pic xmlns:pic="http://schemas.openxmlformats.org/drawingml/2006/picture">
+                  <pic:nvPicPr>
+                    <pic:cNvPr id="1057408434" name="Picture 1057408434"/>
+                    <pic:cNvPicPr/>
+                  </pic:nvPicPr>
+                  <pic:blipFill>
+                    <a:blip r:embed="rId6">
+                      <a:extLst>
+                        <a:ext uri="{28A0092B-C50C-407E-A947-70E740481C1C}">
+                          <a14:useLocalDpi xmlns:a14="http://schemas.microsoft.com/office/drawing/2010/main" val="0"/>
+                        </a:ext>
+                      </a:extLst>
+                    </a:blip>
+                    <a:stretch>
+                      <a:fillRect/>
+                    </a:stretch>
+                  </pic:blipFill>
+                  <pic:spPr>
+                    <a:xfrm>
+                      <a:off x="0" y="0"/>
+                      <a:ext cx="5731510" cy="707390"/>
+                    </a:xfrm>
+                    <a:prstGeom prst="rect">
+                      <a:avLst/>
+                    </a:prstGeom>
+                  </pic:spPr>
+                </pic:pic>
+              </a:graphicData>
+            </a:graphic>
+          </wp:inline>
+        </w:drawing>
+      </w:r>
+    </w:p>
+    <w:p>
+      <w:pPr>
+        <w:rPr>
+          <w:b/>
+          <w:bCs/>
+        </w:rPr>
+      </w:pPr>
+      <w:r>
+        <w:rPr>
+          <w:b/>
+          <w:bCs/>
+          <w:noProof/>
+        </w:rPr>
+        <w:drawing>
+          <wp:inline distT="0" distB="0" distL="0" distR="0" wp14:anchorId="6EAFC027" wp14:editId="59F68FF9">
+            <wp:extent cx="5731510" cy="1016635"/>
+            <wp:effectExtent l="0" t="0" r="2540" b="0"/>
+            <wp:docPr id="1151263798" name="Picture 2"/>
+            <wp:cNvGraphicFramePr>
+              <a:graphicFrameLocks xmlns:a="http://schemas.openxmlformats.org/drawingml/2006/main" noChangeAspect="1"/>
+            </wp:cNvGraphicFramePr>
+            <a:graphic xmlns:a="http://schemas.openxmlformats.org/drawingml/2006/main">
+              <a:graphicData uri="http://schemas.openxmlformats.org/drawingml/2006/picture">
+                <pic:pic xmlns:pic="http://schemas.openxmlformats.org/drawingml/2006/picture">
+                  <pic:nvPicPr>
+                    <pic:cNvPr id="1151263798" name="Picture 1151263798"/>
+                    <pic:cNvPicPr/>
+                  </pic:nvPicPr>
+                  <pic:blipFill>
+                    <a:blip r:embed="rId7">
+                      <a:extLst>
+                        <a:ext uri="{28A0092B-C50C-407E-A947-70E740481C1C}">
+                          <a14:useLocalDpi xmlns:a14="http://schemas.microsoft.com/office/drawing/2010/main" val="0"/>
+                        </a:ext>
+                      </a:extLst>
+                    </a:blip>
+                    <a:stretch>
+                      <a:fillRect/>
+                    </a:stretch>
+                  </pic:blipFill>
+                  <pic:spPr>
+                    <a:xfrm>
+                      <a:off x="0" y="0"/>
+                      <a:ext cx="5731510" cy="1016635"/>
+                    </a:xfrm>
+                    <a:prstGeom prst="rect">
+                      <a:avLst/>
+                    </a:prstGeom>
+                  </pic:spPr>
+                </pic:pic>
+              </a:graphicData>
+            </a:graphic>
+          </wp:inline>
+        </w:drawing>
+      </w:r>
+    </w:p>
+    <w:p>
+      <w:pPr>
+        <w:rPr>
+          <w:b/>
+          <w:bCs/>
+        </w:rPr>
+      </w:pPr>
+      <w:r>
+        <w:rPr>
+          <w:b/>
+          <w:bCs/>
+        </w:rPr>
+        <w:t>Figure: Apache Kafka Producer–Consumer Demonstration</w:t>
+      </w:r>
+    </w:p>
+    <w:p>
+      <w:r>
+        <w:pict w14:anchorId="79389701">
+          <v:rect id="_x0000_i1033" style="width:0;height:1.5pt" o:hralign="center" o:bullet="t" o:hrstd="t" o:hr="t" fillcolor="#a0a0a0" stroked="f"/>
+        </w:pict>
+      </w:r>
+    </w:p>
+    <w:p>
+      <w:r>
+        <w:rPr>
+          <w:b/>
+          <w:bCs/>
+        </w:rPr>
+        <w:t xml:space="preserve">Step </w:t>
+      </w:r>
+      <w:r>
+        <w:rPr>
+          <w:b/>
+          <w:bCs/>
+        </w:rPr>
+        <w:t>4</w:t>
+      </w:r>
+      <w:r>
+        <w:rPr>
+          <w:b/>
+          <w:bCs/>
+        </w:rPr>
+        <w:t xml:space="preserve"> — Apache Airflow Automation</w:t>
+      </w:r>
+    </w:p>
+    <w:p>
+      <w:r>
+        <w:t>Apache Airflow was implemented for workflow orchestration and automation.</w:t>
+      </w:r>
+    </w:p>
+    <w:p>
+      <w:pPr>
+        <w:rPr>
+          <w:b/>
+          <w:bCs/>
+        </w:rPr>
+      </w:pPr>
       <w:r>
         <w:rPr>
           <w:b/>
           <w:bCs/>
         </w:rPr>
         <w:lastRenderedPageBreak/>
-        <w:t>Step 3 — Apache Airflow Automation</w:t>
-      </w:r>
-    </w:p>
-    <w:p>
-      <w:r>
-        <w:t>Apache Airflow was implemented for workflow orchestration and automation.</w:t>
-      </w:r>
-    </w:p>
-    <w:p>
-      <w:pPr>
-        <w:rPr>
-          <w:b/>
-          <w:bCs/>
-        </w:rPr>
-      </w:pPr>
-      <w:r>
-        <w:rPr>
-          <w:b/>
-          <w:bCs/>
-        </w:rPr>
         <w:t>Features:</w:t>
       </w:r>
     </w:p>
@@ -1230,7 +1503,7 @@
                     <pic:cNvPicPr/>
                   </pic:nvPicPr>
                   <pic:blipFill>
-                    <a:blip r:embed="rId6" cstate="print">
+                    <a:blip r:embed="rId8" cstate="print">
                       <a:extLst>
                         <a:ext uri="{28A0092B-C50C-407E-A947-70E740481C1C}">
                           <a14:useLocalDpi xmlns:a14="http://schemas.microsoft.com/office/drawing/2010/main" val="0"/>
@@ -1308,7 +1581,7 @@
                     <pic:cNvPicPr/>
                   </pic:nvPicPr>
                   <pic:blipFill>
-                    <a:blip r:embed="rId7" cstate="print">
+                    <a:blip r:embed="rId9" cstate="print">
                       <a:extLst>
                         <a:ext uri="{28A0092B-C50C-407E-A947-70E740481C1C}">
                           <a14:useLocalDpi xmlns:a14="http://schemas.microsoft.com/office/drawing/2010/main" val="0"/>
@@ -1367,24 +1640,45 @@
     </w:p>
     <w:p>
       <w:r>
+        <w:pict w14:anchorId="0771E3E0">
+          <v:rect id="_x0000_i1034" style="width:0;height:1.5pt" o:hralign="center" o:hrstd="t" o:hr="t" fillcolor="#a0a0a0" stroked="f"/>
+        </w:pict>
+      </w:r>
+    </w:p>
+    <w:p>
+      <w:r>
+        <w:rPr>
+          <w:b/>
+          <w:bCs/>
+        </w:rPr>
+        <w:t xml:space="preserve">Step </w:t>
+      </w:r>
+      <w:r>
+        <w:rPr>
+          <w:b/>
+          <w:bCs/>
+        </w:rPr>
+        <w:t>5</w:t>
+      </w:r>
+      <w:r>
+        <w:rPr>
+          <w:b/>
+          <w:bCs/>
+        </w:rPr>
+        <w:t xml:space="preserve"> — </w:t>
+      </w:r>
+      <w:r>
+        <w:rPr>
+          <w:b/>
+          <w:bCs/>
+        </w:rPr>
+        <w:t>Databricks &amp; PySpark Big Data Processing</w:t>
+      </w:r>
+    </w:p>
+    <w:p>
+      <w:r>
         <w:lastRenderedPageBreak/>
-        <w:pict w14:anchorId="0771E3E0">
-          <v:rect id="_x0000_i1033" style="width:0;height:1.5pt" o:hralign="center" o:hrstd="t" o:hr="t" fillcolor="#a0a0a0" stroked="f"/>
-        </w:pict>
-      </w:r>
-    </w:p>
-    <w:p>
-      <w:r>
-        <w:rPr>
-          <w:b/>
-          <w:bCs/>
-        </w:rPr>
-        <w:t>Step 4 — PySpark Big Data Processing</w:t>
-      </w:r>
-    </w:p>
-    <w:p>
-      <w:r>
-        <w:t>Apache Spark was integrated into the pipeline using PySpark to process large healthcare datasets efficiently.</w:t>
+        <w:t>Apache Spark was integrated into the pipeline using PySpark for efficient processing of large healthcare datasets. The PySpark workflows were also validated using Databricks notebooks to demonstrate industry-standard big data processing and analytics capabilities.</w:t>
       </w:r>
     </w:p>
     <w:p>
@@ -1478,7 +1772,7 @@
                     <pic:cNvPicPr/>
                   </pic:nvPicPr>
                   <pic:blipFill>
-                    <a:blip r:embed="rId8">
+                    <a:blip r:embed="rId10">
                       <a:extLst>
                         <a:ext uri="{28A0092B-C50C-407E-A947-70E740481C1C}">
                           <a14:useLocalDpi xmlns:a14="http://schemas.microsoft.com/office/drawing/2010/main" val="0"/>
@@ -1507,9 +1801,57 @@
     </w:p>
     <w:p>
       <w:r>
+        <w:rPr>
+          <w:noProof/>
+        </w:rPr>
         <w:lastRenderedPageBreak/>
+        <w:drawing>
+          <wp:inline distT="0" distB="0" distL="0" distR="0" wp14:anchorId="2ADE3E30" wp14:editId="67DCAF03">
+            <wp:extent cx="5731510" cy="2861310"/>
+            <wp:effectExtent l="0" t="0" r="2540" b="0"/>
+            <wp:docPr id="509861215" name="Picture 3"/>
+            <wp:cNvGraphicFramePr>
+              <a:graphicFrameLocks xmlns:a="http://schemas.openxmlformats.org/drawingml/2006/main" noChangeAspect="1"/>
+            </wp:cNvGraphicFramePr>
+            <a:graphic xmlns:a="http://schemas.openxmlformats.org/drawingml/2006/main">
+              <a:graphicData uri="http://schemas.openxmlformats.org/drawingml/2006/picture">
+                <pic:pic xmlns:pic="http://schemas.openxmlformats.org/drawingml/2006/picture">
+                  <pic:nvPicPr>
+                    <pic:cNvPr id="509861215" name="Picture 509861215"/>
+                    <pic:cNvPicPr/>
+                  </pic:nvPicPr>
+                  <pic:blipFill>
+                    <a:blip r:embed="rId11" cstate="print">
+                      <a:extLst>
+                        <a:ext uri="{28A0092B-C50C-407E-A947-70E740481C1C}">
+                          <a14:useLocalDpi xmlns:a14="http://schemas.microsoft.com/office/drawing/2010/main" val="0"/>
+                        </a:ext>
+                      </a:extLst>
+                    </a:blip>
+                    <a:stretch>
+                      <a:fillRect/>
+                    </a:stretch>
+                  </pic:blipFill>
+                  <pic:spPr>
+                    <a:xfrm>
+                      <a:off x="0" y="0"/>
+                      <a:ext cx="5731510" cy="2861310"/>
+                    </a:xfrm>
+                    <a:prstGeom prst="rect">
+                      <a:avLst/>
+                    </a:prstGeom>
+                  </pic:spPr>
+                </pic:pic>
+              </a:graphicData>
+            </a:graphic>
+          </wp:inline>
+        </w:drawing>
+      </w:r>
+    </w:p>
+    <w:p>
+      <w:r>
         <w:pict w14:anchorId="644E28B3">
-          <v:rect id="_x0000_i1034" style="width:0;height:1.5pt" o:hralign="center" o:hrstd="t" o:hr="t" fillcolor="#a0a0a0" stroked="f"/>
+          <v:rect id="_x0000_i1035" style="width:0;height:1.5pt" o:hralign="center" o:hrstd="t" o:hr="t" fillcolor="#a0a0a0" stroked="f"/>
         </w:pict>
       </w:r>
     </w:p>
@@ -1519,7 +1861,21 @@
           <w:b/>
           <w:bCs/>
         </w:rPr>
-        <w:t>Step 5 — AWS RDS PostgreSQL Integration</w:t>
+        <w:t xml:space="preserve">Step </w:t>
+      </w:r>
+      <w:r>
+        <w:rPr>
+          <w:b/>
+          <w:bCs/>
+        </w:rPr>
+        <w:t>6</w:t>
+      </w:r>
+      <w:r>
+        <w:rPr>
+          <w:b/>
+          <w:bCs/>
+        </w:rPr>
+        <w:t xml:space="preserve"> — AWS RDS PostgreSQL Integration</w:t>
       </w:r>
     </w:p>
     <w:p>
@@ -1588,7 +1944,7 @@
                     <pic:cNvPicPr/>
                   </pic:nvPicPr>
                   <pic:blipFill>
-                    <a:blip r:embed="rId9" cstate="print">
+                    <a:blip r:embed="rId12" cstate="print">
                       <a:extLst>
                         <a:ext uri="{28A0092B-C50C-407E-A947-70E740481C1C}">
                           <a14:useLocalDpi xmlns:a14="http://schemas.microsoft.com/office/drawing/2010/main" val="0"/>
@@ -1648,7 +2004,7 @@
     <w:p>
       <w:r>
         <w:pict w14:anchorId="257C3D1C">
-          <v:rect id="_x0000_i1035" style="width:0;height:1.5pt" o:hralign="center" o:hrstd="t" o:hr="t" fillcolor="#a0a0a0" stroked="f"/>
+          <v:rect id="_x0000_i1036" style="width:0;height:1.5pt" o:hralign="center" o:hrstd="t" o:hr="t" fillcolor="#a0a0a0" stroked="f"/>
         </w:pict>
       </w:r>
     </w:p>
@@ -1658,7 +2014,22 @@
           <w:b/>
           <w:bCs/>
         </w:rPr>
-        <w:t>Step 6 — Data Warehouse Design</w:t>
+        <w:lastRenderedPageBreak/>
+        <w:t xml:space="preserve">Step </w:t>
+      </w:r>
+      <w:r>
+        <w:rPr>
+          <w:b/>
+          <w:bCs/>
+        </w:rPr>
+        <w:t>7</w:t>
+      </w:r>
+      <w:r>
+        <w:rPr>
+          <w:b/>
+          <w:bCs/>
+        </w:rPr>
+        <w:t xml:space="preserve"> — Data Warehouse Design</w:t>
       </w:r>
     </w:p>
     <w:p>
@@ -1686,13 +2057,8 @@
     </w:p>
     <w:p>
       <w:r>
-        <w:t xml:space="preserve">• </w:t>
-      </w:r>
-      <w:proofErr w:type="spellStart"/>
-      <w:r>
-        <w:t>dim_patient</w:t>
-      </w:r>
-      <w:proofErr w:type="spellEnd"/>
+        <w:t>• dim_patient</w:t>
+      </w:r>
     </w:p>
     <w:p>
       <w:r>
@@ -1701,13 +2067,8 @@
     </w:p>
     <w:p>
       <w:r>
-        <w:t xml:space="preserve">• </w:t>
-      </w:r>
-      <w:proofErr w:type="spellStart"/>
-      <w:r>
-        <w:t>dim_date</w:t>
-      </w:r>
-      <w:proofErr w:type="spellEnd"/>
+        <w:t>• dim_date</w:t>
+      </w:r>
     </w:p>
     <w:p>
       <w:r>
@@ -1734,7 +2095,6 @@
     </w:p>
     <w:p>
       <w:r>
-        <w:lastRenderedPageBreak/>
         <w:t>• Faster analytical queries</w:t>
       </w:r>
     </w:p>
@@ -1774,7 +2134,7 @@
                     <pic:cNvPicPr/>
                   </pic:nvPicPr>
                   <pic:blipFill>
-                    <a:blip r:embed="rId10">
+                    <a:blip r:embed="rId13">
                       <a:extLst>
                         <a:ext uri="{28A0092B-C50C-407E-A947-70E740481C1C}">
                           <a14:useLocalDpi xmlns:a14="http://schemas.microsoft.com/office/drawing/2010/main" val="0"/>
@@ -1804,7 +2164,7 @@
     <w:p>
       <w:r>
         <w:pict w14:anchorId="2A412C19">
-          <v:rect id="_x0000_i1036" style="width:0;height:1.5pt" o:hralign="center" o:hrstd="t" o:hr="t" fillcolor="#a0a0a0" stroked="f"/>
+          <v:rect id="_x0000_i1037" style="width:0;height:1.5pt" o:hralign="center" o:hrstd="t" o:hr="t" fillcolor="#a0a0a0" stroked="f"/>
         </w:pict>
       </w:r>
     </w:p>
@@ -1814,7 +2174,21 @@
           <w:b/>
           <w:bCs/>
         </w:rPr>
-        <w:t>Step 7 — Interactive Dashboard Development</w:t>
+        <w:t xml:space="preserve">Step </w:t>
+      </w:r>
+      <w:r>
+        <w:rPr>
+          <w:b/>
+          <w:bCs/>
+        </w:rPr>
+        <w:t>8</w:t>
+      </w:r>
+      <w:r>
+        <w:rPr>
+          <w:b/>
+          <w:bCs/>
+        </w:rPr>
+        <w:t xml:space="preserve"> — Interactive Dashboard Development</w:t>
       </w:r>
     </w:p>
     <w:p>
@@ -1872,6 +2246,7 @@
         <w:rPr>
           <w:noProof/>
         </w:rPr>
+        <w:lastRenderedPageBreak/>
         <w:drawing>
           <wp:inline distT="0" distB="0" distL="0" distR="0" wp14:anchorId="3FE1A206" wp14:editId="4AD4B8AC">
             <wp:extent cx="5731510" cy="3030855"/>
@@ -1888,7 +2263,7 @@
                     <pic:cNvPicPr/>
                   </pic:nvPicPr>
                   <pic:blipFill>
-                    <a:blip r:embed="rId11" cstate="print">
+                    <a:blip r:embed="rId14" cstate="print">
                       <a:extLst>
                         <a:ext uri="{28A0092B-C50C-407E-A947-70E740481C1C}">
                           <a14:useLocalDpi xmlns:a14="http://schemas.microsoft.com/office/drawing/2010/main" val="0"/>
@@ -1917,9 +2292,8 @@
     </w:p>
     <w:p>
       <w:r>
-        <w:lastRenderedPageBreak/>
         <w:pict w14:anchorId="21457527">
-          <v:rect id="_x0000_i1037" style="width:0;height:1.5pt" o:hralign="center" o:hrstd="t" o:hr="t" fillcolor="#a0a0a0" stroked="f"/>
+          <v:rect id="_x0000_i1038" style="width:0;height:1.5pt" o:hralign="center" o:hrstd="t" o:hr="t" fillcolor="#a0a0a0" stroked="f"/>
         </w:pict>
       </w:r>
     </w:p>
@@ -1998,6 +2372,21 @@
       </w:r>
     </w:p>
     <w:p>
+      <w:r>
+        <w:t>• Implemented Apache Kafka streaming demonstration</w:t>
+      </w:r>
+    </w:p>
+    <w:p>
+      <w:r>
+        <w:t>• Executed PySpark processing in Databricks</w:t>
+      </w:r>
+    </w:p>
+    <w:p>
+      <w:r>
+        <w:t>• Implemented GitHub Actions CI/CD workflow</w:t>
+      </w:r>
+    </w:p>
+    <w:p>
       <w:pPr>
         <w:rPr>
           <w:b/>
@@ -2011,6 +2400,14 @@
         </w:rPr>
         <w:t>Performance Summary</w:t>
       </w:r>
+    </w:p>
+    <w:p>
+      <w:pPr>
+        <w:rPr>
+          <w:b/>
+          <w:bCs/>
+        </w:rPr>
+      </w:pPr>
     </w:p>
     <w:tbl>
       <w:tblPr>
@@ -2033,8 +2430,8 @@
         <w:tblLook w:val="04A0" w:firstRow="1" w:lastRow="0" w:firstColumn="1" w:lastColumn="0" w:noHBand="0" w:noVBand="1"/>
       </w:tblPr>
       <w:tblGrid>
-        <w:gridCol w:w="3318"/>
-        <w:gridCol w:w="1436"/>
+        <w:gridCol w:w="3323"/>
+        <w:gridCol w:w="1431"/>
       </w:tblGrid>
       <w:tr>
         <w:trPr>
@@ -2060,6 +2457,7 @@
                 <w:b/>
                 <w:bCs/>
               </w:rPr>
+              <w:lastRenderedPageBreak/>
               <w:t>Component</w:t>
             </w:r>
           </w:p>
@@ -2327,6 +2725,90 @@
           </w:p>
         </w:tc>
       </w:tr>
+      <w:tr>
+        <w:trPr>
+          <w:trHeight w:val="501"/>
+          <w:tblCellSpacing w:w="15" w:type="dxa"/>
+        </w:trPr>
+        <w:tc>
+          <w:tcPr>
+            <w:tcW w:w="0" w:type="auto"/>
+            <w:vAlign w:val="center"/>
+          </w:tcPr>
+          <w:p>
+            <w:r>
+              <w:t>Apache Kafka Integration</w:t>
+            </w:r>
+          </w:p>
+        </w:tc>
+        <w:tc>
+          <w:tcPr>
+            <w:tcW w:w="0" w:type="auto"/>
+            <w:vAlign w:val="center"/>
+          </w:tcPr>
+          <w:p>
+            <w:r>
+              <w:t>Successful</w:t>
+            </w:r>
+          </w:p>
+        </w:tc>
+      </w:tr>
+      <w:tr>
+        <w:trPr>
+          <w:trHeight w:val="501"/>
+          <w:tblCellSpacing w:w="15" w:type="dxa"/>
+        </w:trPr>
+        <w:tc>
+          <w:tcPr>
+            <w:tcW w:w="0" w:type="auto"/>
+            <w:vAlign w:val="center"/>
+          </w:tcPr>
+          <w:p>
+            <w:r>
+              <w:t>Databricks Processing</w:t>
+            </w:r>
+          </w:p>
+        </w:tc>
+        <w:tc>
+          <w:tcPr>
+            <w:tcW w:w="0" w:type="auto"/>
+            <w:vAlign w:val="center"/>
+          </w:tcPr>
+          <w:p>
+            <w:r>
+              <w:t>Successful</w:t>
+            </w:r>
+          </w:p>
+        </w:tc>
+      </w:tr>
+      <w:tr>
+        <w:trPr>
+          <w:trHeight w:val="501"/>
+          <w:tblCellSpacing w:w="15" w:type="dxa"/>
+        </w:trPr>
+        <w:tc>
+          <w:tcPr>
+            <w:tcW w:w="0" w:type="auto"/>
+            <w:vAlign w:val="center"/>
+          </w:tcPr>
+          <w:p>
+            <w:r>
+              <w:t>GitHub Actions CI/CD</w:t>
+            </w:r>
+          </w:p>
+        </w:tc>
+        <w:tc>
+          <w:tcPr>
+            <w:tcW w:w="0" w:type="auto"/>
+            <w:vAlign w:val="center"/>
+          </w:tcPr>
+          <w:p>
+            <w:r>
+              <w:t>Successful</w:t>
+            </w:r>
+          </w:p>
+        </w:tc>
+      </w:tr>
     </w:tbl>
     <w:p/>
     <w:p>
@@ -2334,7 +2816,6 @@
         <w:rPr>
           <w:noProof/>
         </w:rPr>
-        <w:lastRenderedPageBreak/>
         <w:drawing>
           <wp:inline distT="0" distB="0" distL="0" distR="0" wp14:anchorId="1E340D98" wp14:editId="493E853B">
             <wp:extent cx="5731510" cy="2404110"/>
@@ -2351,7 +2832,7 @@
                     <pic:cNvPicPr/>
                   </pic:nvPicPr>
                   <pic:blipFill>
-                    <a:blip r:embed="rId12">
+                    <a:blip r:embed="rId15">
                       <a:extLst>
                         <a:ext uri="{28A0092B-C50C-407E-A947-70E740481C1C}">
                           <a14:useLocalDpi xmlns:a14="http://schemas.microsoft.com/office/drawing/2010/main" val="0"/>
@@ -2383,6 +2864,7 @@
         <w:rPr>
           <w:noProof/>
         </w:rPr>
+        <w:lastRenderedPageBreak/>
         <w:drawing>
           <wp:inline distT="0" distB="0" distL="0" distR="0" wp14:anchorId="5A267429" wp14:editId="50D65DAE">
             <wp:extent cx="5731510" cy="6042660"/>
@@ -2399,7 +2881,7 @@
                     <pic:cNvPicPr/>
                   </pic:nvPicPr>
                   <pic:blipFill>
-                    <a:blip r:embed="rId13">
+                    <a:blip r:embed="rId16">
                       <a:extLst>
                         <a:ext uri="{28A0092B-C50C-407E-A947-70E740481C1C}">
                           <a14:useLocalDpi xmlns:a14="http://schemas.microsoft.com/office/drawing/2010/main" val="0"/>
@@ -2426,12 +2908,74 @@
         </w:drawing>
       </w:r>
     </w:p>
-    <w:p/>
+    <w:p>
+      <w:r>
+        <w:rPr>
+          <w:noProof/>
+        </w:rPr>
+        <w:drawing>
+          <wp:inline distT="0" distB="0" distL="0" distR="0" wp14:anchorId="33424D64" wp14:editId="5912D4C0">
+            <wp:extent cx="5731510" cy="2340610"/>
+            <wp:effectExtent l="0" t="0" r="2540" b="2540"/>
+            <wp:docPr id="1220535710" name="Picture 4"/>
+            <wp:cNvGraphicFramePr>
+              <a:graphicFrameLocks xmlns:a="http://schemas.openxmlformats.org/drawingml/2006/main" noChangeAspect="1"/>
+            </wp:cNvGraphicFramePr>
+            <a:graphic xmlns:a="http://schemas.openxmlformats.org/drawingml/2006/main">
+              <a:graphicData uri="http://schemas.openxmlformats.org/drawingml/2006/picture">
+                <pic:pic xmlns:pic="http://schemas.openxmlformats.org/drawingml/2006/picture">
+                  <pic:nvPicPr>
+                    <pic:cNvPr id="1220535710" name="Picture 1220535710"/>
+                    <pic:cNvPicPr/>
+                  </pic:nvPicPr>
+                  <pic:blipFill>
+                    <a:blip r:embed="rId17" cstate="print">
+                      <a:extLst>
+                        <a:ext uri="{28A0092B-C50C-407E-A947-70E740481C1C}">
+                          <a14:useLocalDpi xmlns:a14="http://schemas.microsoft.com/office/drawing/2010/main" val="0"/>
+                        </a:ext>
+                      </a:extLst>
+                    </a:blip>
+                    <a:stretch>
+                      <a:fillRect/>
+                    </a:stretch>
+                  </pic:blipFill>
+                  <pic:spPr>
+                    <a:xfrm>
+                      <a:off x="0" y="0"/>
+                      <a:ext cx="5731510" cy="2340610"/>
+                    </a:xfrm>
+                    <a:prstGeom prst="rect">
+                      <a:avLst/>
+                    </a:prstGeom>
+                  </pic:spPr>
+                </pic:pic>
+              </a:graphicData>
+            </a:graphic>
+          </wp:inline>
+        </w:drawing>
+      </w:r>
+    </w:p>
+    <w:p>
+      <w:pPr>
+        <w:rPr>
+          <w:b/>
+          <w:bCs/>
+        </w:rPr>
+      </w:pPr>
+      <w:r>
+        <w:rPr>
+          <w:b/>
+          <w:bCs/>
+        </w:rPr>
+        <w:t>Figure: Databricks Notebook Executing PySpark Processing</w:t>
+      </w:r>
+    </w:p>
     <w:p>
       <w:r>
         <w:lastRenderedPageBreak/>
         <w:pict w14:anchorId="00AC2A3F">
-          <v:rect id="_x0000_i1038" style="width:0;height:1.5pt" o:hralign="center" o:hrstd="t" o:hr="t" fillcolor="#a0a0a0" stroked="f"/>
+          <v:rect id="_x0000_i1039" style="width:0;height:1.5pt" o:hralign="center" o:hrstd="t" o:hr="t" fillcolor="#a0a0a0" stroked="f"/>
         </w:pict>
       </w:r>
     </w:p>
@@ -2869,8 +3413,45 @@
           </w:p>
         </w:tc>
       </w:tr>
+      <w:tr>
+        <w:trPr>
+          <w:tblCellSpacing w:w="15" w:type="dxa"/>
+        </w:trPr>
+        <w:tc>
+          <w:tcPr>
+            <w:tcW w:w="0" w:type="auto"/>
+            <w:vAlign w:val="center"/>
+          </w:tcPr>
+          <w:p>
+            <w:r>
+              <w:t>CI/CD Automation</w:t>
+            </w:r>
+          </w:p>
+        </w:tc>
+        <w:tc>
+          <w:tcPr>
+            <w:tcW w:w="0" w:type="auto"/>
+            <w:vAlign w:val="center"/>
+          </w:tcPr>
+          <w:p>
+            <w:r>
+              <w:t>Not Available</w:t>
+            </w:r>
+          </w:p>
+        </w:tc>
+        <w:tc>
+          <w:tcPr>
+            <w:tcW w:w="0" w:type="auto"/>
+            <w:vAlign w:val="center"/>
+          </w:tcPr>
+          <w:p>
+            <w:r>
+              <w:t>Implemented</w:t>
+            </w:r>
+          </w:p>
+        </w:tc>
+      </w:tr>
     </w:tbl>
-    <w:p/>
     <w:p>
       <w:r>
         <w:t>The proposed system significantly improves scalability, automation, reporting capabilities, and analytical performance compared to traditional healthcare data processing approaches.</w:t>
@@ -2879,7 +3460,7 @@
     <w:p>
       <w:r>
         <w:pict w14:anchorId="67DD5487">
-          <v:rect id="_x0000_i1039" style="width:0;height:1.5pt" o:hralign="center" o:hrstd="t" o:hr="t" fillcolor="#a0a0a0" stroked="f"/>
+          <v:rect id="_x0000_i1040" style="width:0;height:1.5pt" o:hralign="center" o:hrstd="t" o:hr="t" fillcolor="#a0a0a0" stroked="f"/>
         </w:pict>
       </w:r>
     </w:p>
@@ -2946,10 +3527,10 @@
         </w:rPr>
         <w:lastRenderedPageBreak/>
         <w:drawing>
-          <wp:inline distT="0" distB="0" distL="0" distR="0" wp14:anchorId="380FC7D9" wp14:editId="3BCAA121">
-            <wp:extent cx="5633720" cy="5448300"/>
-            <wp:effectExtent l="133350" t="114300" r="138430" b="171450"/>
-            <wp:docPr id="31449608" name="Picture 1"/>
+          <wp:inline distT="0" distB="0" distL="0" distR="0" wp14:anchorId="1A17B4BE" wp14:editId="0C456EC3">
+            <wp:extent cx="5105400" cy="4663440"/>
+            <wp:effectExtent l="133350" t="114300" r="133350" b="137160"/>
+            <wp:docPr id="1856016608" name="Picture 1"/>
             <wp:cNvGraphicFramePr>
               <a:graphicFrameLocks xmlns:a="http://schemas.openxmlformats.org/drawingml/2006/main" noChangeAspect="1"/>
             </wp:cNvGraphicFramePr>
@@ -2957,11 +3538,11 @@
               <a:graphicData uri="http://schemas.openxmlformats.org/drawingml/2006/picture">
                 <pic:pic xmlns:pic="http://schemas.openxmlformats.org/drawingml/2006/picture">
                   <pic:nvPicPr>
-                    <pic:cNvPr id="31449608" name="Picture 31449608"/>
+                    <pic:cNvPr id="1856016608" name="Picture 1856016608"/>
                     <pic:cNvPicPr/>
                   </pic:nvPicPr>
                   <pic:blipFill>
-                    <a:blip r:embed="rId14">
+                    <a:blip r:embed="rId18">
                       <a:extLst>
                         <a:ext uri="{28A0092B-C50C-407E-A947-70E740481C1C}">
                           <a14:useLocalDpi xmlns:a14="http://schemas.microsoft.com/office/drawing/2010/main" val="0"/>
@@ -2975,7 +3556,7 @@
                   <pic:spPr>
                     <a:xfrm>
                       <a:off x="0" y="0"/>
-                      <a:ext cx="5633720" cy="5448300"/>
+                      <a:ext cx="5110119" cy="4667750"/>
                     </a:xfrm>
                     <a:prstGeom prst="rect">
                       <a:avLst/>
@@ -3036,113 +3617,6 @@
     <w:p>
       <w:r>
         <w:pict w14:anchorId="12DE7860">
-          <v:rect id="_x0000_i1040" style="width:0;height:1.5pt" o:hralign="center" o:hrstd="t" o:hr="t" fillcolor="#a0a0a0" stroked="f"/>
-        </w:pict>
-      </w:r>
-    </w:p>
-    <w:p>
-      <w:r>
-        <w:rPr>
-          <w:b/>
-          <w:bCs/>
-        </w:rPr>
-        <w:t>PART 9 — DATA GOVERNANCE</w:t>
-      </w:r>
-    </w:p>
-    <w:p>
-      <w:r>
-        <w:t>Healthcare data requires proper governance, validation, and security controls to ensure data quality and reliability.</w:t>
-      </w:r>
-    </w:p>
-    <w:p>
-      <w:pPr>
-        <w:rPr>
-          <w:b/>
-          <w:bCs/>
-        </w:rPr>
-      </w:pPr>
-      <w:r>
-        <w:rPr>
-          <w:b/>
-          <w:bCs/>
-        </w:rPr>
-        <w:t>Data Governance Measures:</w:t>
-      </w:r>
-    </w:p>
-    <w:p>
-      <w:r>
-        <w:t>• Validation of incoming healthcare records</w:t>
-      </w:r>
-    </w:p>
-    <w:p>
-      <w:r>
-        <w:t>• Missing value detection and handling</w:t>
-      </w:r>
-    </w:p>
-    <w:p>
-      <w:r>
-        <w:t>• Duplicate record identification</w:t>
-      </w:r>
-    </w:p>
-    <w:p>
-      <w:r>
-        <w:t>• Data consistency checks</w:t>
-      </w:r>
-    </w:p>
-    <w:p>
-      <w:r>
-        <w:t>• Structured database design</w:t>
-      </w:r>
-    </w:p>
-    <w:p>
-      <w:r>
-        <w:lastRenderedPageBreak/>
-        <w:t>• Secure cloud storage using AWS services</w:t>
-      </w:r>
-    </w:p>
-    <w:p>
-      <w:r>
-        <w:t>• Controlled access to healthcare information</w:t>
-      </w:r>
-    </w:p>
-    <w:p>
-      <w:pPr>
-        <w:rPr>
-          <w:b/>
-          <w:bCs/>
-        </w:rPr>
-      </w:pPr>
-      <w:r>
-        <w:rPr>
-          <w:b/>
-          <w:bCs/>
-        </w:rPr>
-        <w:t>Benefits:</w:t>
-      </w:r>
-    </w:p>
-    <w:p>
-      <w:r>
-        <w:t>• Improved data quality</w:t>
-      </w:r>
-    </w:p>
-    <w:p>
-      <w:r>
-        <w:t>• Reliable analytics</w:t>
-      </w:r>
-    </w:p>
-    <w:p>
-      <w:r>
-        <w:t>• Better reporting accuracy</w:t>
-      </w:r>
-    </w:p>
-    <w:p>
-      <w:r>
-        <w:t>• Enhanced data integrity</w:t>
-      </w:r>
-    </w:p>
-    <w:p>
-      <w:r>
-        <w:pict w14:anchorId="644E7408">
           <v:rect id="_x0000_i1041" style="width:0;height:1.5pt" o:hralign="center" o:hrstd="t" o:hr="t" fillcolor="#a0a0a0" stroked="f"/>
         </w:pict>
       </w:r>
@@ -3153,17 +3627,12 @@
           <w:b/>
           <w:bCs/>
         </w:rPr>
-        <w:t>PART 10 — CONCLUSION</w:t>
-      </w:r>
-    </w:p>
-    <w:p>
-      <w:r>
-        <w:t>This project successfully demonstrates the implementation of a complete Healthcare Analytics Pipeline for MediCare Hospital.</w:t>
-      </w:r>
-    </w:p>
-    <w:p>
-      <w:r>
-        <w:t>The system integrates AWS S3, Apache Airflow, PySpark, PostgreSQL, AWS RDS, Data Warehousing, Machine Learning, and Streamlit into a single analytics platform.</w:t>
+        <w:t>PART 9 — DATA GOVERNANCE</w:t>
+      </w:r>
+    </w:p>
+    <w:p>
+      <w:r>
+        <w:t>Healthcare data requires proper governance, validation, and security controls to ensure data quality and reliability.</w:t>
       </w:r>
     </w:p>
     <w:p>
@@ -3178,47 +3647,83 @@
           <w:b/>
           <w:bCs/>
         </w:rPr>
-        <w:t>Major Achievements:</w:t>
-      </w:r>
-    </w:p>
-    <w:p>
-      <w:r>
-        <w:t>• Automated healthcare data processing</w:t>
-      </w:r>
-    </w:p>
-    <w:p>
-      <w:r>
-        <w:t>• Cloud-based storage and database integration</w:t>
-      </w:r>
-    </w:p>
-    <w:p>
-      <w:r>
-        <w:t>• Big data processing using PySpark</w:t>
-      </w:r>
-    </w:p>
-    <w:p>
-      <w:r>
-        <w:t>• Interactive dashboard development</w:t>
-      </w:r>
-    </w:p>
-    <w:p>
-      <w:r>
-        <w:t>• Machine learning implementation</w:t>
-      </w:r>
-    </w:p>
-    <w:p>
-      <w:r>
-        <w:t>• Data warehouse design for analytics</w:t>
-      </w:r>
-    </w:p>
-    <w:p>
-      <w:r>
-        <w:t>The project demonstrates practical applications of Data Engineering concepts and provides a scalable solution for healthcare analytics.</w:t>
-      </w:r>
-    </w:p>
-    <w:p>
-      <w:r>
-        <w:pict w14:anchorId="30C644E7">
+        <w:t>Data Governance Measures:</w:t>
+      </w:r>
+    </w:p>
+    <w:p>
+      <w:r>
+        <w:t>• Validation of incoming healthcare records</w:t>
+      </w:r>
+    </w:p>
+    <w:p>
+      <w:r>
+        <w:t>• Missing value detection and handling</w:t>
+      </w:r>
+    </w:p>
+    <w:p>
+      <w:r>
+        <w:t>• Duplicate record identification</w:t>
+      </w:r>
+    </w:p>
+    <w:p>
+      <w:r>
+        <w:t>• Data consistency checks</w:t>
+      </w:r>
+    </w:p>
+    <w:p>
+      <w:r>
+        <w:t>• Structured database design</w:t>
+      </w:r>
+    </w:p>
+    <w:p>
+      <w:r>
+        <w:t>• Secure cloud storage using AWS services</w:t>
+      </w:r>
+    </w:p>
+    <w:p>
+      <w:r>
+        <w:t>• Controlled access to healthcare information</w:t>
+      </w:r>
+    </w:p>
+    <w:p>
+      <w:pPr>
+        <w:rPr>
+          <w:b/>
+          <w:bCs/>
+        </w:rPr>
+      </w:pPr>
+      <w:r>
+        <w:rPr>
+          <w:b/>
+          <w:bCs/>
+        </w:rPr>
+        <w:t>Benefits:</w:t>
+      </w:r>
+    </w:p>
+    <w:p>
+      <w:r>
+        <w:lastRenderedPageBreak/>
+        <w:t>• Improved data quality</w:t>
+      </w:r>
+    </w:p>
+    <w:p>
+      <w:r>
+        <w:t>• Reliable analytics</w:t>
+      </w:r>
+    </w:p>
+    <w:p>
+      <w:r>
+        <w:t>• Better reporting accuracy</w:t>
+      </w:r>
+    </w:p>
+    <w:p>
+      <w:r>
+        <w:t>• Enhanced data integrity</w:t>
+      </w:r>
+    </w:p>
+    <w:p>
+      <w:r>
+        <w:pict w14:anchorId="644E7408">
           <v:rect id="_x0000_i1042" style="width:0;height:1.5pt" o:hralign="center" o:hrstd="t" o:hr="t" fillcolor="#a0a0a0" stroked="f"/>
         </w:pict>
       </w:r>
@@ -3229,78 +3734,72 @@
           <w:b/>
           <w:bCs/>
         </w:rPr>
-        <w:t>PART 11 — FUTURE SCOPE</w:t>
-      </w:r>
-    </w:p>
-    <w:p>
-      <w:r>
-        <w:t>The Healthcare Analytics Pipeline can be further enhanced using advanced technologies and real-time processing capabilities.</w:t>
-      </w:r>
-    </w:p>
-    <w:p>
-      <w:pPr>
-        <w:rPr>
-          <w:b/>
-          <w:bCs/>
-        </w:rPr>
-      </w:pPr>
-      <w:r>
-        <w:rPr>
-          <w:b/>
-          <w:bCs/>
-        </w:rPr>
-        <w:t>Future Enhancements:</w:t>
-      </w:r>
-    </w:p>
-    <w:p>
-      <w:r>
-        <w:t>• Real-time data streaming using Apache Kafka</w:t>
-      </w:r>
-    </w:p>
-    <w:p>
-      <w:r>
-        <w:t>• Advanced machine learning models</w:t>
-      </w:r>
-    </w:p>
-    <w:p>
-      <w:r>
-        <w:t>• Integration with hospital management systems</w:t>
-      </w:r>
-    </w:p>
-    <w:p>
-      <w:r>
-        <w:t>• Automated alert generation</w:t>
-      </w:r>
-    </w:p>
-    <w:p>
-      <w:r>
-        <w:t>• Cloud-native deployment</w:t>
-      </w:r>
-    </w:p>
-    <w:p>
-      <w:r>
-        <w:lastRenderedPageBreak/>
-        <w:t>• Mobile dashboard integration</w:t>
-      </w:r>
-    </w:p>
-    <w:p>
-      <w:r>
-        <w:t>• Predictive healthcare analytics</w:t>
-      </w:r>
-    </w:p>
-    <w:p>
-      <w:r>
-        <w:t>• Enterprise-scale implementation</w:t>
-      </w:r>
-    </w:p>
-    <w:p>
-      <w:r>
-        <w:t>These improvements can further increase the scalability and analytical capabilities of the platform.</w:t>
-      </w:r>
-    </w:p>
-    <w:p>
-      <w:r>
-        <w:pict w14:anchorId="414E1E45">
+        <w:t>PART 10 — CONCLUSION</w:t>
+      </w:r>
+    </w:p>
+    <w:p>
+      <w:r>
+        <w:t>This project successfully demonstrates the implementation of a complete Healthcare Analytics Pipeline for MediCare Hospital.</w:t>
+      </w:r>
+    </w:p>
+    <w:p>
+      <w:r>
+        <w:t>The system integrates AWS S3, Apache Kafka, Python ETL, Databricks, PySpark, Apache Airflow, PostgreSQL, AWS RDS, Data Warehousing, Machine Learning, Streamlit, Docker, and GitHub Actions CI/CD into a unified analytics platform.</w:t>
+      </w:r>
+    </w:p>
+    <w:p>
+      <w:r>
+        <w:t>Major Achievements:</w:t>
+      </w:r>
+    </w:p>
+    <w:p>
+      <w:r>
+        <w:t>• Automated healthcare data processing</w:t>
+      </w:r>
+    </w:p>
+    <w:p>
+      <w:r>
+        <w:t>• Cloud-based storage and database integration</w:t>
+      </w:r>
+    </w:p>
+    <w:p>
+      <w:r>
+        <w:t>• Real-time streaming demonstration using Apache Kafka</w:t>
+      </w:r>
+    </w:p>
+    <w:p>
+      <w:r>
+        <w:t>• Big data processing using Databricks and PySpark</w:t>
+      </w:r>
+    </w:p>
+    <w:p>
+      <w:r>
+        <w:t>• Interactive dashboard development</w:t>
+      </w:r>
+    </w:p>
+    <w:p>
+      <w:r>
+        <w:t>• Machine learning implementation</w:t>
+      </w:r>
+    </w:p>
+    <w:p>
+      <w:r>
+        <w:t>• CI/CD workflow automation using GitHub Actions</w:t>
+      </w:r>
+    </w:p>
+    <w:p>
+      <w:r>
+        <w:t>• Data warehouse design for analytical reporting</w:t>
+      </w:r>
+    </w:p>
+    <w:p>
+      <w:r>
+        <w:t>The project demonstrates practical applications of Data Engineering, Cloud Computing, Big Data Processing, Analytics, Machine Learning, and DevOps concepts in a healthcare environment.</w:t>
+      </w:r>
+    </w:p>
+    <w:p>
+      <w:r>
+        <w:pict w14:anchorId="30C644E7">
           <v:rect id="_x0000_i1043" style="width:0;height:1.5pt" o:hralign="center" o:hrstd="t" o:hr="t" fillcolor="#a0a0a0" stroked="f"/>
         </w:pict>
       </w:r>
@@ -3311,7 +3810,12 @@
           <w:b/>
           <w:bCs/>
         </w:rPr>
-        <w:t>PART 12 — SOURCE CODE STRUCTURE</w:t>
+        <w:t>PART 11 — FUTURE SCOPE</w:t>
+      </w:r>
+    </w:p>
+    <w:p>
+      <w:r>
+        <w:t>The Healthcare Analytics Pipeline can be further enhanced using advanced technologies and real-time processing capabilities.</w:t>
       </w:r>
     </w:p>
     <w:p>
@@ -3326,337 +3830,544 @@
           <w:b/>
           <w:bCs/>
         </w:rPr>
-        <w:t>Project Directory Structure:</w:t>
-      </w:r>
-    </w:p>
-    <w:p>
-      <w:r>
-        <w:t>healthcare-analytics-pipeline/</w:t>
-      </w:r>
-    </w:p>
-    <w:p>
-      <w:r>
-        <w:rPr>
-          <w:rFonts w:ascii="MS Gothic" w:eastAsia="MS Gothic" w:hAnsi="MS Gothic" w:cs="MS Gothic" w:hint="eastAsia"/>
-        </w:rPr>
-        <w:t>├</w:t>
-      </w:r>
-      <w:r>
-        <w:rPr>
-          <w:rFonts w:ascii="Calibri" w:hAnsi="Calibri" w:cs="Calibri"/>
-        </w:rPr>
-        <w:t>──</w:t>
-      </w:r>
-      <w:r>
-        <w:t xml:space="preserve"> dashboards/</w:t>
-      </w:r>
-    </w:p>
-    <w:p>
-      <w:r>
-        <w:t>│ └── app.py</w:t>
-      </w:r>
-    </w:p>
-    <w:p>
-      <w:r>
-        <w:rPr>
-          <w:rFonts w:ascii="MS Gothic" w:eastAsia="MS Gothic" w:hAnsi="MS Gothic" w:cs="MS Gothic" w:hint="eastAsia"/>
-        </w:rPr>
-        <w:t>├</w:t>
-      </w:r>
-      <w:r>
-        <w:rPr>
-          <w:rFonts w:ascii="Calibri" w:hAnsi="Calibri" w:cs="Calibri"/>
-        </w:rPr>
-        <w:t>──</w:t>
-      </w:r>
-      <w:r>
-        <w:t xml:space="preserve"> data/</w:t>
-      </w:r>
-    </w:p>
-    <w:p>
-      <w:r>
-        <w:t xml:space="preserve">│ </w:t>
-      </w:r>
-      <w:r>
-        <w:rPr>
-          <w:rFonts w:ascii="MS Gothic" w:eastAsia="MS Gothic" w:hAnsi="MS Gothic" w:cs="MS Gothic" w:hint="eastAsia"/>
-        </w:rPr>
-        <w:t>├</w:t>
-      </w:r>
-      <w:r>
-        <w:rPr>
-          <w:rFonts w:ascii="Calibri" w:hAnsi="Calibri" w:cs="Calibri"/>
-        </w:rPr>
-        <w:t>──</w:t>
-      </w:r>
-      <w:r>
-        <w:t xml:space="preserve"> patients.csv</w:t>
-      </w:r>
-    </w:p>
-    <w:p>
-      <w:r>
-        <w:t>│ └── healthcare_big_data.csv</w:t>
-      </w:r>
-    </w:p>
-    <w:p>
-      <w:r>
-        <w:rPr>
-          <w:rFonts w:ascii="MS Gothic" w:eastAsia="MS Gothic" w:hAnsi="MS Gothic" w:cs="MS Gothic" w:hint="eastAsia"/>
-        </w:rPr>
-        <w:t>├</w:t>
-      </w:r>
-      <w:r>
-        <w:rPr>
-          <w:rFonts w:ascii="Calibri" w:hAnsi="Calibri" w:cs="Calibri"/>
-        </w:rPr>
-        <w:t>──</w:t>
-      </w:r>
-      <w:r>
-        <w:t xml:space="preserve"> docker_airflow/</w:t>
-      </w:r>
-    </w:p>
-    <w:p>
-      <w:r>
-        <w:t xml:space="preserve">│ └── </w:t>
-      </w:r>
-      <w:proofErr w:type="spellStart"/>
-      <w:r>
-        <w:t>dags</w:t>
-      </w:r>
-      <w:proofErr w:type="spellEnd"/>
-      <w:r>
-        <w:t>/</w:t>
-      </w:r>
-    </w:p>
-    <w:p>
-      <w:r>
-        <w:t>│ └── healthcare_etl_dag.py</w:t>
-      </w:r>
-    </w:p>
-    <w:p>
-      <w:r>
-        <w:rPr>
-          <w:rFonts w:ascii="MS Gothic" w:eastAsia="MS Gothic" w:hAnsi="MS Gothic" w:cs="MS Gothic" w:hint="eastAsia"/>
-        </w:rPr>
-        <w:t>├</w:t>
-      </w:r>
-      <w:r>
-        <w:rPr>
-          <w:rFonts w:ascii="Calibri" w:hAnsi="Calibri" w:cs="Calibri"/>
-        </w:rPr>
-        <w:t>──</w:t>
-      </w:r>
-      <w:r>
-        <w:t xml:space="preserve"> docs/</w:t>
-      </w:r>
-    </w:p>
-    <w:p>
-      <w:r>
-        <w:rPr>
-          <w:rFonts w:ascii="MS Gothic" w:eastAsia="MS Gothic" w:hAnsi="MS Gothic" w:cs="MS Gothic" w:hint="eastAsia"/>
-        </w:rPr>
-        <w:t>├</w:t>
-      </w:r>
-      <w:r>
-        <w:rPr>
-          <w:rFonts w:ascii="Calibri" w:hAnsi="Calibri" w:cs="Calibri"/>
-        </w:rPr>
-        <w:t>──</w:t>
-      </w:r>
-      <w:r>
-        <w:t xml:space="preserve"> screenshots/</w:t>
-      </w:r>
-    </w:p>
-    <w:p>
-      <w:r>
-        <w:rPr>
-          <w:rFonts w:ascii="MS Gothic" w:eastAsia="MS Gothic" w:hAnsi="MS Gothic" w:cs="MS Gothic" w:hint="eastAsia"/>
-        </w:rPr>
-        <w:t>├</w:t>
-      </w:r>
-      <w:r>
-        <w:rPr>
-          <w:rFonts w:ascii="Calibri" w:hAnsi="Calibri" w:cs="Calibri"/>
-        </w:rPr>
-        <w:t>──</w:t>
-      </w:r>
-      <w:r>
-        <w:t xml:space="preserve"> scripts/</w:t>
-      </w:r>
-    </w:p>
-    <w:p>
-      <w:r>
-        <w:t xml:space="preserve">│ </w:t>
-      </w:r>
-      <w:r>
-        <w:rPr>
-          <w:rFonts w:ascii="MS Gothic" w:eastAsia="MS Gothic" w:hAnsi="MS Gothic" w:cs="MS Gothic" w:hint="eastAsia"/>
-        </w:rPr>
-        <w:t>├</w:t>
-      </w:r>
-      <w:r>
-        <w:rPr>
-          <w:rFonts w:ascii="Calibri" w:hAnsi="Calibri" w:cs="Calibri"/>
-        </w:rPr>
-        <w:t>──</w:t>
-      </w:r>
-      <w:r>
-        <w:t xml:space="preserve"> etl_pipeline.py</w:t>
-      </w:r>
-    </w:p>
-    <w:p>
-      <w:r>
-        <w:t xml:space="preserve">│ </w:t>
-      </w:r>
-      <w:r>
-        <w:rPr>
-          <w:rFonts w:ascii="MS Gothic" w:eastAsia="MS Gothic" w:hAnsi="MS Gothic" w:cs="MS Gothic" w:hint="eastAsia"/>
-        </w:rPr>
-        <w:t>├</w:t>
-      </w:r>
-      <w:r>
-        <w:rPr>
-          <w:rFonts w:ascii="Calibri" w:hAnsi="Calibri" w:cs="Calibri"/>
-        </w:rPr>
-        <w:t>──</w:t>
-      </w:r>
-      <w:r>
-        <w:t xml:space="preserve"> spark_pipeline.py</w:t>
-      </w:r>
-    </w:p>
-    <w:p>
-      <w:r>
-        <w:t xml:space="preserve">│ </w:t>
-      </w:r>
-      <w:r>
-        <w:rPr>
-          <w:rFonts w:ascii="MS Gothic" w:eastAsia="MS Gothic" w:hAnsi="MS Gothic" w:cs="MS Gothic" w:hint="eastAsia"/>
-        </w:rPr>
-        <w:t>├</w:t>
-      </w:r>
-      <w:r>
-        <w:rPr>
-          <w:rFonts w:ascii="Calibri" w:hAnsi="Calibri" w:cs="Calibri"/>
-        </w:rPr>
-        <w:t>──</w:t>
-      </w:r>
-      <w:r>
-        <w:t xml:space="preserve"> data_warehouse.py</w:t>
-      </w:r>
-    </w:p>
-    <w:p>
-      <w:r>
-        <w:t xml:space="preserve">│ </w:t>
-      </w:r>
-      <w:r>
-        <w:rPr>
-          <w:rFonts w:ascii="MS Gothic" w:eastAsia="MS Gothic" w:hAnsi="MS Gothic" w:cs="MS Gothic" w:hint="eastAsia"/>
-        </w:rPr>
-        <w:t>├</w:t>
-      </w:r>
-      <w:r>
-        <w:rPr>
-          <w:rFonts w:ascii="Calibri" w:hAnsi="Calibri" w:cs="Calibri"/>
-        </w:rPr>
-        <w:t>──</w:t>
-      </w:r>
-      <w:r>
-        <w:t xml:space="preserve"> ml_prediction.py</w:t>
-      </w:r>
-    </w:p>
-    <w:p>
-      <w:r>
-        <w:t>│ └── eda_analysis.py</w:t>
-      </w:r>
-    </w:p>
-    <w:p>
-      <w:r>
-        <w:rPr>
-          <w:rFonts w:ascii="MS Gothic" w:eastAsia="MS Gothic" w:hAnsi="MS Gothic" w:cs="MS Gothic" w:hint="eastAsia"/>
-        </w:rPr>
-        <w:t>├</w:t>
-      </w:r>
-      <w:r>
-        <w:rPr>
-          <w:rFonts w:ascii="Calibri" w:hAnsi="Calibri" w:cs="Calibri"/>
-        </w:rPr>
-        <w:t>──</w:t>
-      </w:r>
-      <w:r>
-        <w:t xml:space="preserve"> </w:t>
-      </w:r>
-      <w:proofErr w:type="spellStart"/>
-      <w:r>
-        <w:t>sql</w:t>
-      </w:r>
-      <w:proofErr w:type="spellEnd"/>
-      <w:r>
-        <w:t>/</w:t>
-      </w:r>
-    </w:p>
-    <w:p>
-      <w:r>
-        <w:t xml:space="preserve">│ └── </w:t>
-      </w:r>
-      <w:proofErr w:type="spellStart"/>
-      <w:r>
-        <w:t>healthcare_queries.sql</w:t>
-      </w:r>
-      <w:proofErr w:type="spellEnd"/>
-    </w:p>
-    <w:p>
-      <w:r>
-        <w:rPr>
-          <w:rFonts w:ascii="MS Gothic" w:eastAsia="MS Gothic" w:hAnsi="MS Gothic" w:cs="MS Gothic" w:hint="eastAsia"/>
-        </w:rPr>
-        <w:t>├</w:t>
-      </w:r>
-      <w:r>
-        <w:rPr>
-          <w:rFonts w:ascii="Calibri" w:hAnsi="Calibri" w:cs="Calibri"/>
-        </w:rPr>
-        <w:t>──</w:t>
-      </w:r>
-      <w:r>
-        <w:t xml:space="preserve"> README.md</w:t>
-      </w:r>
-    </w:p>
-    <w:p>
-      <w:r>
-        <w:rPr>
-          <w:rFonts w:ascii="MS Gothic" w:eastAsia="MS Gothic" w:hAnsi="MS Gothic" w:cs="MS Gothic" w:hint="eastAsia"/>
-        </w:rPr>
-        <w:t>├</w:t>
-      </w:r>
-      <w:r>
-        <w:rPr>
-          <w:rFonts w:ascii="Calibri" w:hAnsi="Calibri" w:cs="Calibri"/>
-        </w:rPr>
-        <w:t>──</w:t>
-      </w:r>
-      <w:r>
-        <w:t xml:space="preserve"> requirements.txt</w:t>
-      </w:r>
-    </w:p>
-    <w:p>
-      <w:r>
-        <w:t>└── .gitignore</w:t>
-      </w:r>
-    </w:p>
-    <w:p>
-      <w:r>
-        <w:pict w14:anchorId="6CEC1A6D">
+        <w:t>Future Enhancements:</w:t>
+      </w:r>
+    </w:p>
+    <w:p>
+      <w:r>
+        <w:t>• Advanced machine learning models</w:t>
+      </w:r>
+    </w:p>
+    <w:p>
+      <w:r>
+        <w:t>• Integration with hospital management systems</w:t>
+      </w:r>
+    </w:p>
+    <w:p>
+      <w:r>
+        <w:t>• Automated alert generation</w:t>
+      </w:r>
+    </w:p>
+    <w:p>
+      <w:r>
+        <w:t>• Cloud-native deployment</w:t>
+      </w:r>
+    </w:p>
+    <w:p>
+      <w:r>
+        <w:t>• Mobile dashboard integration</w:t>
+      </w:r>
+    </w:p>
+    <w:p>
+      <w:r>
+        <w:t>• Predictive healthcare analytics</w:t>
+      </w:r>
+    </w:p>
+    <w:p>
+      <w:r>
+        <w:lastRenderedPageBreak/>
+        <w:t>• Enterprise-scale implementation</w:t>
+      </w:r>
+    </w:p>
+    <w:p>
+      <w:r>
+        <w:t>• Snowflake Data Warehouse Integration</w:t>
+      </w:r>
+    </w:p>
+    <w:p>
+      <w:r>
+        <w:t>• Kubernetes-based Container Orchestration</w:t>
+      </w:r>
+    </w:p>
+    <w:p>
+      <w:r>
+        <w:t>• Production-grade Apache Kafka streaming architecture</w:t>
+      </w:r>
+      <w:r>
+        <w:t>.</w:t>
+      </w:r>
+    </w:p>
+    <w:p>
+      <w:r>
+        <w:t>These improvements can further increase the scalability and analytical capabilities of the platform.</w:t>
+      </w:r>
+    </w:p>
+    <w:p>
+      <w:r>
+        <w:pict w14:anchorId="414E1E45">
           <v:rect id="_x0000_i1044" style="width:0;height:1.5pt" o:hralign="center" o:hrstd="t" o:hr="t" fillcolor="#a0a0a0" stroked="f"/>
         </w:pict>
       </w:r>
     </w:p>
     <w:p>
-      <w:r>
-        <w:rPr>
-          <w:b/>
-          <w:bCs/>
-        </w:rPr>
+      <w:pPr>
+        <w:rPr>
+          <w:b/>
+          <w:bCs/>
+        </w:rPr>
+      </w:pPr>
+      <w:r>
+        <w:rPr>
+          <w:b/>
+          <w:bCs/>
+        </w:rPr>
+        <w:t>PART 12 — SOURCE CODE STRUCTURE</w:t>
+      </w:r>
+    </w:p>
+    <w:p>
+      <w:r>
+        <w:t>Project Directory Structure:</w:t>
+      </w:r>
+    </w:p>
+    <w:p>
+      <w:r>
+        <w:t>healthcare-analytics-pipeline/</w:t>
+      </w:r>
+    </w:p>
+    <w:p>
+      <w:r>
+        <w:rPr>
+          <w:rFonts w:ascii="MS Gothic" w:eastAsia="MS Gothic" w:hAnsi="MS Gothic" w:cs="MS Gothic" w:hint="eastAsia"/>
+        </w:rPr>
+        <w:t>├</w:t>
+      </w:r>
+      <w:r>
+        <w:rPr>
+          <w:rFonts w:ascii="Calibri" w:hAnsi="Calibri" w:cs="Calibri"/>
+        </w:rPr>
+        <w:t>──</w:t>
+      </w:r>
+      <w:r>
+        <w:t xml:space="preserve"> .github/</w:t>
+      </w:r>
+    </w:p>
+    <w:p>
+      <w:r>
+        <w:t>│ └── workflows/</w:t>
+      </w:r>
+    </w:p>
+    <w:p>
+      <w:r>
+        <w:t>│ └── main.yml</w:t>
+      </w:r>
+    </w:p>
+    <w:p>
+      <w:r>
+        <w:rPr>
+          <w:rFonts w:ascii="MS Gothic" w:eastAsia="MS Gothic" w:hAnsi="MS Gothic" w:cs="MS Gothic" w:hint="eastAsia"/>
+        </w:rPr>
+        <w:t>├</w:t>
+      </w:r>
+      <w:r>
+        <w:rPr>
+          <w:rFonts w:ascii="Calibri" w:hAnsi="Calibri" w:cs="Calibri"/>
+        </w:rPr>
+        <w:t>──</w:t>
+      </w:r>
+      <w:r>
+        <w:t xml:space="preserve"> dashboards/</w:t>
+      </w:r>
+    </w:p>
+    <w:p>
+      <w:r>
+        <w:t xml:space="preserve">│ </w:t>
+      </w:r>
+      <w:r>
+        <w:rPr>
+          <w:rFonts w:ascii="MS Gothic" w:eastAsia="MS Gothic" w:hAnsi="MS Gothic" w:cs="MS Gothic" w:hint="eastAsia"/>
+        </w:rPr>
+        <w:t>├</w:t>
+      </w:r>
+      <w:r>
+        <w:rPr>
+          <w:rFonts w:ascii="Calibri" w:hAnsi="Calibri" w:cs="Calibri"/>
+        </w:rPr>
+        <w:t>──</w:t>
+      </w:r>
+      <w:r>
+        <w:t xml:space="preserve"> app.py</w:t>
+      </w:r>
+    </w:p>
+    <w:p>
+      <w:r>
+        <w:t>│ └── app_live.py</w:t>
+      </w:r>
+    </w:p>
+    <w:p>
+      <w:r>
+        <w:rPr>
+          <w:rFonts w:ascii="MS Gothic" w:eastAsia="MS Gothic" w:hAnsi="MS Gothic" w:cs="MS Gothic" w:hint="eastAsia"/>
+        </w:rPr>
+        <w:t>├</w:t>
+      </w:r>
+      <w:r>
+        <w:rPr>
+          <w:rFonts w:ascii="Calibri" w:hAnsi="Calibri" w:cs="Calibri"/>
+        </w:rPr>
+        <w:t>──</w:t>
+      </w:r>
+      <w:r>
+        <w:t xml:space="preserve"> data/</w:t>
+      </w:r>
+    </w:p>
+    <w:p>
+      <w:r>
+        <w:t xml:space="preserve">│ </w:t>
+      </w:r>
+      <w:r>
+        <w:rPr>
+          <w:rFonts w:ascii="MS Gothic" w:eastAsia="MS Gothic" w:hAnsi="MS Gothic" w:cs="MS Gothic" w:hint="eastAsia"/>
+        </w:rPr>
+        <w:t>├</w:t>
+      </w:r>
+      <w:r>
+        <w:rPr>
+          <w:rFonts w:ascii="Calibri" w:hAnsi="Calibri" w:cs="Calibri"/>
+        </w:rPr>
+        <w:t>──</w:t>
+      </w:r>
+      <w:r>
+        <w:t xml:space="preserve"> patients.csv</w:t>
+      </w:r>
+    </w:p>
+    <w:p>
+      <w:r>
+        <w:t>│ └── healthcare_big_data.csv</w:t>
+      </w:r>
+    </w:p>
+    <w:p>
+      <w:r>
+        <w:rPr>
+          <w:rFonts w:ascii="MS Gothic" w:eastAsia="MS Gothic" w:hAnsi="MS Gothic" w:cs="MS Gothic" w:hint="eastAsia"/>
+        </w:rPr>
+        <w:t>├</w:t>
+      </w:r>
+      <w:r>
+        <w:rPr>
+          <w:rFonts w:ascii="Calibri" w:hAnsi="Calibri" w:cs="Calibri"/>
+        </w:rPr>
+        <w:t>──</w:t>
+      </w:r>
+      <w:r>
+        <w:t xml:space="preserve"> docker_airflow/</w:t>
+      </w:r>
+    </w:p>
+    <w:p>
+      <w:r>
+        <w:t xml:space="preserve">│ </w:t>
+      </w:r>
+      <w:r>
+        <w:rPr>
+          <w:rFonts w:ascii="MS Gothic" w:eastAsia="MS Gothic" w:hAnsi="MS Gothic" w:cs="MS Gothic" w:hint="eastAsia"/>
+        </w:rPr>
+        <w:t>├</w:t>
+      </w:r>
+      <w:r>
+        <w:rPr>
+          <w:rFonts w:ascii="Calibri" w:hAnsi="Calibri" w:cs="Calibri"/>
+        </w:rPr>
+        <w:t>──</w:t>
+      </w:r>
+      <w:r>
+        <w:t xml:space="preserve"> </w:t>
+      </w:r>
+      <w:proofErr w:type="spellStart"/>
+      <w:r>
+        <w:t>dags</w:t>
+      </w:r>
+      <w:proofErr w:type="spellEnd"/>
+      <w:r>
+        <w:t>/</w:t>
+      </w:r>
+    </w:p>
+    <w:p>
+      <w:r>
+        <w:t>│ │ └── healthcare_etl_dag.py</w:t>
+      </w:r>
+    </w:p>
+    <w:p>
+      <w:r>
+        <w:t>│ └── docker-compose.yml</w:t>
+      </w:r>
+    </w:p>
+    <w:p>
+      <w:r>
+        <w:rPr>
+          <w:rFonts w:ascii="MS Gothic" w:eastAsia="MS Gothic" w:hAnsi="MS Gothic" w:cs="MS Gothic" w:hint="eastAsia"/>
+        </w:rPr>
+        <w:t>├</w:t>
+      </w:r>
+      <w:r>
+        <w:rPr>
+          <w:rFonts w:ascii="Calibri" w:hAnsi="Calibri" w:cs="Calibri"/>
+        </w:rPr>
+        <w:t>──</w:t>
+      </w:r>
+      <w:r>
+        <w:t xml:space="preserve"> docs/</w:t>
+      </w:r>
+    </w:p>
+    <w:p>
+      <w:r>
+        <w:rPr>
+          <w:rFonts w:ascii="MS Gothic" w:eastAsia="MS Gothic" w:hAnsi="MS Gothic" w:cs="MS Gothic" w:hint="eastAsia"/>
+        </w:rPr>
+        <w:t>├</w:t>
+      </w:r>
+      <w:r>
+        <w:rPr>
+          <w:rFonts w:ascii="Calibri" w:hAnsi="Calibri" w:cs="Calibri"/>
+        </w:rPr>
+        <w:t>──</w:t>
+      </w:r>
+      <w:r>
+        <w:t xml:space="preserve"> kafka_demo/</w:t>
+      </w:r>
+    </w:p>
+    <w:p>
+      <w:r>
+        <w:t xml:space="preserve">│ </w:t>
+      </w:r>
+      <w:r>
+        <w:rPr>
+          <w:rFonts w:ascii="MS Gothic" w:eastAsia="MS Gothic" w:hAnsi="MS Gothic" w:cs="MS Gothic" w:hint="eastAsia"/>
+        </w:rPr>
+        <w:t>├</w:t>
+      </w:r>
+      <w:r>
+        <w:rPr>
+          <w:rFonts w:ascii="Calibri" w:hAnsi="Calibri" w:cs="Calibri"/>
+        </w:rPr>
+        <w:t>──</w:t>
+      </w:r>
+      <w:r>
+        <w:t xml:space="preserve"> producer.py</w:t>
+      </w:r>
+    </w:p>
+    <w:p>
+      <w:r>
+        <w:t>│ └── consumer.py</w:t>
+      </w:r>
+    </w:p>
+    <w:p>
+      <w:r>
+        <w:rPr>
+          <w:rFonts w:ascii="MS Gothic" w:eastAsia="MS Gothic" w:hAnsi="MS Gothic" w:cs="MS Gothic" w:hint="eastAsia"/>
+        </w:rPr>
+        <w:t>├</w:t>
+      </w:r>
+      <w:r>
+        <w:rPr>
+          <w:rFonts w:ascii="Calibri" w:hAnsi="Calibri" w:cs="Calibri"/>
+        </w:rPr>
+        <w:t>──</w:t>
+      </w:r>
+      <w:r>
+        <w:t xml:space="preserve"> screenshots/</w:t>
+      </w:r>
+    </w:p>
+    <w:p>
+      <w:r>
+        <w:rPr>
+          <w:rFonts w:ascii="MS Gothic" w:eastAsia="MS Gothic" w:hAnsi="MS Gothic" w:cs="MS Gothic" w:hint="eastAsia"/>
+        </w:rPr>
+        <w:t>├</w:t>
+      </w:r>
+      <w:r>
+        <w:rPr>
+          <w:rFonts w:ascii="Calibri" w:hAnsi="Calibri" w:cs="Calibri"/>
+        </w:rPr>
+        <w:t>──</w:t>
+      </w:r>
+      <w:r>
+        <w:t xml:space="preserve"> scripts/</w:t>
+      </w:r>
+    </w:p>
+    <w:p>
+      <w:r>
+        <w:t xml:space="preserve">│ </w:t>
+      </w:r>
+      <w:r>
+        <w:rPr>
+          <w:rFonts w:ascii="MS Gothic" w:eastAsia="MS Gothic" w:hAnsi="MS Gothic" w:cs="MS Gothic" w:hint="eastAsia"/>
+        </w:rPr>
+        <w:t>├</w:t>
+      </w:r>
+      <w:r>
+        <w:rPr>
+          <w:rFonts w:ascii="Calibri" w:hAnsi="Calibri" w:cs="Calibri"/>
+        </w:rPr>
+        <w:t>──</w:t>
+      </w:r>
+      <w:r>
+        <w:t xml:space="preserve"> etl_pipeline.py</w:t>
+      </w:r>
+    </w:p>
+    <w:p>
+      <w:r>
+        <w:t xml:space="preserve">│ </w:t>
+      </w:r>
+      <w:r>
+        <w:rPr>
+          <w:rFonts w:ascii="MS Gothic" w:eastAsia="MS Gothic" w:hAnsi="MS Gothic" w:cs="MS Gothic" w:hint="eastAsia"/>
+        </w:rPr>
+        <w:t>├</w:t>
+      </w:r>
+      <w:r>
+        <w:rPr>
+          <w:rFonts w:ascii="Calibri" w:hAnsi="Calibri" w:cs="Calibri"/>
+        </w:rPr>
+        <w:t>──</w:t>
+      </w:r>
+      <w:r>
+        <w:t xml:space="preserve"> spark_pipeline.py</w:t>
+      </w:r>
+    </w:p>
+    <w:p>
+      <w:r>
         <w:lastRenderedPageBreak/>
+        <w:t xml:space="preserve">│ </w:t>
+      </w:r>
+      <w:r>
+        <w:rPr>
+          <w:rFonts w:ascii="MS Gothic" w:eastAsia="MS Gothic" w:hAnsi="MS Gothic" w:cs="MS Gothic" w:hint="eastAsia"/>
+        </w:rPr>
+        <w:t>├</w:t>
+      </w:r>
+      <w:r>
+        <w:rPr>
+          <w:rFonts w:ascii="Calibri" w:hAnsi="Calibri" w:cs="Calibri"/>
+        </w:rPr>
+        <w:t>──</w:t>
+      </w:r>
+      <w:r>
+        <w:t xml:space="preserve"> data_warehouse.py</w:t>
+      </w:r>
+    </w:p>
+    <w:p>
+      <w:r>
+        <w:t xml:space="preserve">│ </w:t>
+      </w:r>
+      <w:r>
+        <w:rPr>
+          <w:rFonts w:ascii="MS Gothic" w:eastAsia="MS Gothic" w:hAnsi="MS Gothic" w:cs="MS Gothic" w:hint="eastAsia"/>
+        </w:rPr>
+        <w:t>├</w:t>
+      </w:r>
+      <w:r>
+        <w:rPr>
+          <w:rFonts w:ascii="Calibri" w:hAnsi="Calibri" w:cs="Calibri"/>
+        </w:rPr>
+        <w:t>──</w:t>
+      </w:r>
+      <w:r>
+        <w:t xml:space="preserve"> ml_prediction.py</w:t>
+      </w:r>
+    </w:p>
+    <w:p>
+      <w:r>
+        <w:t>│ └── eda_analysis.py</w:t>
+      </w:r>
+    </w:p>
+    <w:p>
+      <w:r>
+        <w:rPr>
+          <w:rFonts w:ascii="MS Gothic" w:eastAsia="MS Gothic" w:hAnsi="MS Gothic" w:cs="MS Gothic" w:hint="eastAsia"/>
+        </w:rPr>
+        <w:t>├</w:t>
+      </w:r>
+      <w:r>
+        <w:rPr>
+          <w:rFonts w:ascii="Calibri" w:hAnsi="Calibri" w:cs="Calibri"/>
+        </w:rPr>
+        <w:t>──</w:t>
+      </w:r>
+      <w:r>
+        <w:t xml:space="preserve"> </w:t>
+      </w:r>
+      <w:proofErr w:type="spellStart"/>
+      <w:r>
+        <w:t>sql</w:t>
+      </w:r>
+      <w:proofErr w:type="spellEnd"/>
+      <w:r>
+        <w:t>/</w:t>
+      </w:r>
+    </w:p>
+    <w:p>
+      <w:r>
+        <w:t>│ └── healthcare_queries.sql</w:t>
+      </w:r>
+    </w:p>
+    <w:p>
+      <w:r>
+        <w:rPr>
+          <w:rFonts w:ascii="MS Gothic" w:eastAsia="MS Gothic" w:hAnsi="MS Gothic" w:cs="MS Gothic" w:hint="eastAsia"/>
+        </w:rPr>
+        <w:t>├</w:t>
+      </w:r>
+      <w:r>
+        <w:rPr>
+          <w:rFonts w:ascii="Calibri" w:hAnsi="Calibri" w:cs="Calibri"/>
+        </w:rPr>
+        <w:t>──</w:t>
+      </w:r>
+      <w:r>
+        <w:t xml:space="preserve"> weekly_reports/</w:t>
+      </w:r>
+    </w:p>
+    <w:p>
+      <w:r>
+        <w:rPr>
+          <w:rFonts w:ascii="MS Gothic" w:eastAsia="MS Gothic" w:hAnsi="MS Gothic" w:cs="MS Gothic" w:hint="eastAsia"/>
+        </w:rPr>
+        <w:t>├</w:t>
+      </w:r>
+      <w:r>
+        <w:rPr>
+          <w:rFonts w:ascii="Calibri" w:hAnsi="Calibri" w:cs="Calibri"/>
+        </w:rPr>
+        <w:t>──</w:t>
+      </w:r>
+      <w:r>
+        <w:t xml:space="preserve"> README.md</w:t>
+      </w:r>
+    </w:p>
+    <w:p>
+      <w:r>
+        <w:rPr>
+          <w:rFonts w:ascii="MS Gothic" w:eastAsia="MS Gothic" w:hAnsi="MS Gothic" w:cs="MS Gothic" w:hint="eastAsia"/>
+        </w:rPr>
+        <w:t>├</w:t>
+      </w:r>
+      <w:r>
+        <w:rPr>
+          <w:rFonts w:ascii="Calibri" w:hAnsi="Calibri" w:cs="Calibri"/>
+        </w:rPr>
+        <w:t>──</w:t>
+      </w:r>
+      <w:r>
+        <w:t xml:space="preserve"> requirements.txt</w:t>
+      </w:r>
+    </w:p>
+    <w:p>
+      <w:r>
+        <w:t>└── .gitignore</w:t>
+      </w:r>
+    </w:p>
+    <w:p>
+      <w:r>
+        <w:pict w14:anchorId="6CEC1A6D">
+          <v:rect id="_x0000_i1045" style="width:0;height:1.5pt" o:hralign="center" o:hrstd="t" o:hr="t" fillcolor="#a0a0a0" stroked="f"/>
+        </w:pict>
+      </w:r>
+    </w:p>
+    <w:p>
+      <w:r>
+        <w:rPr>
+          <w:b/>
+          <w:bCs/>
+        </w:rPr>
         <w:t>PART 13 — ISSUES FACED &amp; SOLUTIONS</w:t>
       </w:r>
     </w:p>
@@ -3908,8 +4619,34 @@
           </w:p>
         </w:tc>
       </w:tr>
+      <w:tr>
+        <w:trPr>
+          <w:tblCellSpacing w:w="15" w:type="dxa"/>
+        </w:trPr>
+        <w:tc>
+          <w:tcPr>
+            <w:tcW w:w="3190" w:type="dxa"/>
+            <w:vAlign w:val="center"/>
+          </w:tcPr>
+          <w:p>
+            <w:r>
+              <w:t>Kafka Configuration Issues</w:t>
+            </w:r>
+          </w:p>
+        </w:tc>
+        <w:tc>
+          <w:tcPr>
+            <w:tcW w:w="3285" w:type="dxa"/>
+            <w:vAlign w:val="center"/>
+          </w:tcPr>
+          <w:p>
+            <w:r>
+              <w:t>Resolved Producer-Consumer Connectivity</w:t>
+            </w:r>
+          </w:p>
+        </w:tc>
+      </w:tr>
     </w:tbl>
-    <w:p/>
     <w:p>
       <w:r>
         <w:t>The above issues were resolved through testing, debugging, and configuration improvements.</w:t>
@@ -3918,7 +4655,7 @@
     <w:p>
       <w:r>
         <w:pict w14:anchorId="38BEADE0">
-          <v:rect id="_x0000_i1045" style="width:0;height:1.5pt" o:hralign="center" o:hrstd="t" o:hr="t" fillcolor="#a0a0a0" stroked="f"/>
+          <v:rect id="_x0000_i1046" style="width:0;height:1.5pt" o:hralign="center" o:hrstd="t" o:hr="t" fillcolor="#a0a0a0" stroked="f"/>
         </w:pict>
       </w:r>
     </w:p>
@@ -3979,7 +4716,7 @@
           <w:bCs/>
         </w:rPr>
       </w:pPr>
-      <w:hyperlink r:id="rId15" w:history="1">
+      <w:hyperlink r:id="rId19" w:history="1">
         <w:r>
           <w:rPr>
             <w:rStyle w:val="Hyperlink"/>
@@ -4007,6 +4744,7 @@
     </w:p>
     <w:p>
       <w:r>
+        <w:lastRenderedPageBreak/>
         <w:t>The Streamlit dashboard provides healthcare analytics, KPI monitoring, disease analysis, and interactive reporting.</w:t>
       </w:r>
     </w:p>
@@ -4032,7 +4770,7 @@
           <w:bCs/>
         </w:rPr>
       </w:pPr>
-      <w:hyperlink r:id="rId16" w:history="1">
+      <w:hyperlink r:id="rId20" w:history="1">
         <w:r>
           <w:rPr>
             <w:rStyle w:val="Hyperlink"/>
@@ -4056,63 +4794,6 @@
           <w:bCs/>
         </w:rPr>
         <w:pict w14:anchorId="34BE3648">
-          <v:rect id="_x0000_i1046" style="width:0;height:1.5pt" o:hralign="center" o:hrstd="t" o:hr="t" fillcolor="#a0a0a0" stroked="f"/>
-        </w:pict>
-      </w:r>
-    </w:p>
-    <w:p>
-      <w:pPr>
-        <w:rPr>
-          <w:b/>
-          <w:bCs/>
-        </w:rPr>
-      </w:pPr>
-      <w:r>
-        <w:rPr>
-          <w:b/>
-          <w:bCs/>
-        </w:rPr>
-        <w:t>Project Demonstration</w:t>
-      </w:r>
-    </w:p>
-    <w:p>
-      <w:pPr>
-        <w:rPr>
-          <w:b/>
-          <w:bCs/>
-        </w:rPr>
-      </w:pPr>
-      <w:r>
-        <w:rPr>
-          <w:b/>
-          <w:bCs/>
-        </w:rPr>
-        <w:t>Project Workflow:</w:t>
-      </w:r>
-    </w:p>
-    <w:p>
-      <w:pPr>
-        <w:rPr>
-          <w:b/>
-          <w:bCs/>
-        </w:rPr>
-      </w:pPr>
-      <w:r>
-        <w:rPr>
-          <w:b/>
-          <w:bCs/>
-        </w:rPr>
-        <w:t>Healthcare Dataset → AWS S3 → ETL Pipeline → Apache Airflow → PySpark → AWS RDS PostgreSQL → Data Warehouse → Machine Learning → Streamlit Dashboard</w:t>
-      </w:r>
-    </w:p>
-    <w:p>
-      <w:r>
-        <w:t>The project successfully automates healthcare data processing, analytics, and reporting through an end-to-end data engineering pipeline.</w:t>
-      </w:r>
-    </w:p>
-    <w:p>
-      <w:r>
-        <w:pict w14:anchorId="062141F8">
           <v:rect id="_x0000_i1047" style="width:0;height:1.5pt" o:hralign="center" o:hrstd="t" o:hr="t" fillcolor="#a0a0a0" stroked="f"/>
         </w:pict>
       </w:r>
@@ -4124,6 +4805,55 @@
           <w:bCs/>
         </w:rPr>
       </w:pPr>
+      <w:r>
+        <w:rPr>
+          <w:b/>
+          <w:bCs/>
+        </w:rPr>
+        <w:t>Project Demonstration</w:t>
+      </w:r>
+    </w:p>
+    <w:p>
+      <w:pPr>
+        <w:rPr>
+          <w:b/>
+          <w:bCs/>
+        </w:rPr>
+      </w:pPr>
+      <w:r>
+        <w:rPr>
+          <w:b/>
+          <w:bCs/>
+        </w:rPr>
+        <w:t>Project Workflow:</w:t>
+      </w:r>
+    </w:p>
+    <w:p>
+      <w:pPr>
+        <w:rPr>
+          <w:b/>
+          <w:bCs/>
+        </w:rPr>
+      </w:pPr>
+      <w:r>
+        <w:rPr>
+          <w:b/>
+          <w:bCs/>
+        </w:rPr>
+        <w:t>Healthcare Dataset → AWS S3 → Apache Kafka → Python ETL → Databricks/PySpark → AWS RDS PostgreSQL → Data Warehouse → Apache Airflow → SQL Analytics → Machine Learning → Streamlit Dashboard</w:t>
+      </w:r>
+    </w:p>
+    <w:p>
+      <w:r>
+        <w:t>The project successfully automates healthcare data processing, analytics, and reporting through an end-to-end data engineering pipeline.</w:t>
+      </w:r>
+    </w:p>
+    <w:p>
+      <w:r>
+        <w:pict w14:anchorId="062141F8">
+          <v:rect id="_x0000_i1048" style="width:0;height:1.5pt" o:hralign="center" o:hrstd="t" o:hr="t" fillcolor="#a0a0a0" stroked="f"/>
+        </w:pict>
+      </w:r>
     </w:p>
     <w:p>
       <w:r>
@@ -4147,7 +4877,7 @@
     <w:p>
       <w:r>
         <w:pict w14:anchorId="44EC8788">
-          <v:rect id="_x0000_i1048" style="width:0;height:1.5pt" o:hralign="center" o:hrstd="t" o:hr="t" fillcolor="#a0a0a0" stroked="f"/>
+          <v:rect id="_x0000_i1049" style="width:0;height:1.5pt" o:hralign="center" o:hrstd="t" o:hr="t" fillcolor="#a0a0a0" stroked="f"/>
         </w:pict>
       </w:r>
     </w:p>
@@ -4784,6 +5514,7 @@
   <w:style w:type="character" w:default="1" w:styleId="DefaultParagraphFont">
     <w:name w:val="Default Paragraph Font"/>
     <w:uiPriority w:val="1"/>
+    <w:semiHidden/>
     <w:unhideWhenUsed/>
   </w:style>
   <w:style w:type="table" w:default="1" w:styleId="TableNormal">
@@ -5120,6 +5851,19 @@
       <w:shd w:val="clear" w:color="auto" w:fill="E1DFDD"/>
     </w:rPr>
   </w:style>
+  <w:style w:type="paragraph" w:styleId="NormalWeb">
+    <w:name w:val="Normal (Web)"/>
+    <w:basedOn w:val="Normal"/>
+    <w:uiPriority w:val="99"/>
+    <w:semiHidden/>
+    <w:unhideWhenUsed/>
+    <w:rsid w:val="007E1452"/>
+    <w:rPr>
+      <w:rFonts w:ascii="Times New Roman" w:hAnsi="Times New Roman" w:cs="Times New Roman"/>
+      <w:sz w:val="24"/>
+      <w:szCs w:val="24"/>
+    </w:rPr>
+  </w:style>
 </w:styles>
 </file>
 

</xml_diff>